<commit_message>
Reconstruit le tableau des produits à partir du dossier de fiches techniques France Décoration
Remplace les produits génériques par les références réelles du
dossier de fiches techniques (annexe QUALIBAT) : système Placo/
Stil pour les jouées, Ecophon Hygiène Performance/Protect Air +
trappe Connect + grille France Air pour les faux plafonds,
Weberprim/Weberniv/Cegecol/Emulcim/Uzin pour les sols, Beissier/
Muroprim-Seigneurie/Indeko-Caparol/Sinto/Primwood/Freitamétal/
Print ADR/Garnysatin S2P pour la peinture. Met à jour les
méthodologies d'exécution (§2.9 et §2.10) en cohérence.

Co-Authored-By: Claude Sonnet 5 <noreply@anthropic.com>
Claude-Session: https://claude.ai/code/session_016J8ZBxzUkBqS3C16QP9P63
</commit_message>
<xml_diff>
--- a/livrables/Lot3_Chapitre2_Organisation_Methodologie.docx
+++ b/livrables/Lot3_Chapitre2_Organisation_Methodologie.docx
@@ -102,7 +102,21 @@
           <w:i w:val="0"/>
           <w:sz w:val="21"/>
         </w:rPr>
-        <w:t>Les fiches techniques de l'ensemble des produits ci-dessous sont jointes en annexe du présent mémoire (dossier « Fiches techniques »). Chaque produit est rattaché à l'article du CCTP Lot 3 qui le prescrit.</w:t>
+        <w:t>Ce tableau est établi à partir du dossier de fiches techniques de France Décoration (annexe jointe au présent mémoire, certifiée QUALIBAT). Chaque produit retenu y est rattaché à l'article du CCTP Lot 3 qui prescrit l'ouvrage correspondant.</w:t>
+      </w:r>
+    </w:p>
+    <w:p>
+      <w:pPr>
+        <w:spacing w:before="160" w:after="60"/>
+      </w:pPr>
+      <w:r>
+        <w:rPr>
+          <w:b/>
+          <w:i/>
+          <w:color w:val="2E74B5"/>
+          <w:sz w:val="21"/>
+        </w:rPr>
+        <w:t>Faux plafonds et jouées</w:t>
       </w:r>
     </w:p>
     <w:tbl>
@@ -113,15 +127,14 @@
         <w:tblLook w:firstColumn="1" w:firstRow="1" w:lastColumn="0" w:lastRow="0" w:noHBand="0" w:noVBand="1" w:val="04A0"/>
       </w:tblPr>
       <w:tblGrid>
-        <w:gridCol w:w="2493"/>
-        <w:gridCol w:w="2493"/>
-        <w:gridCol w:w="2493"/>
-        <w:gridCol w:w="2493"/>
+        <w:gridCol w:w="3324"/>
+        <w:gridCol w:w="3324"/>
+        <w:gridCol w:w="3324"/>
       </w:tblGrid>
       <w:tr>
         <w:tc>
           <w:tcPr>
-            <w:tcW w:type="dxa" w:w="1531"/>
+            <w:tcW w:type="dxa" w:w="1304"/>
             <w:shd w:val="clear" w:color="auto" w:fill="2E74B5"/>
           </w:tcPr>
           <w:p>
@@ -138,7 +151,7 @@
         </w:tc>
         <w:tc>
           <w:tcPr>
-            <w:tcW w:type="dxa" w:w="2835"/>
+            <w:tcW w:type="dxa" w:w="5499"/>
             <w:shd w:val="clear" w:color="auto" w:fill="2E74B5"/>
           </w:tcPr>
           <w:p>
@@ -149,13 +162,13 @@
                 <w:color w:val="FFFFFF"/>
                 <w:sz w:val="18"/>
               </w:rPr>
-              <w:t>Ouvrage concerné</w:t>
-            </w:r>
-          </w:p>
-        </w:tc>
-        <w:tc>
-          <w:tcPr>
-            <w:tcW w:type="dxa" w:w="3572"/>
+              <w:t>Produit (fiche technique)</w:t>
+            </w:r>
+          </w:p>
+        </w:tc>
+        <w:tc>
+          <w:tcPr>
+            <w:tcW w:type="dxa" w:w="1984"/>
             <w:shd w:val="clear" w:color="auto" w:fill="2E74B5"/>
           </w:tcPr>
           <w:p>
@@ -166,23 +179,6 @@
                 <w:color w:val="FFFFFF"/>
                 <w:sz w:val="18"/>
               </w:rPr>
-              <w:t>Produit / référence prescrite</w:t>
-            </w:r>
-          </w:p>
-        </w:tc>
-        <w:tc>
-          <w:tcPr>
-            <w:tcW w:type="dxa" w:w="1417"/>
-            <w:shd w:val="clear" w:color="auto" w:fill="2E74B5"/>
-          </w:tcPr>
-          <w:p>
-            <w:r/>
-            <w:r>
-              <w:rPr>
-                <w:b/>
-                <w:color w:val="FFFFFF"/>
-                <w:sz w:val="18"/>
-              </w:rPr>
               <w:t>Fabricant</w:t>
             </w:r>
           </w:p>
@@ -191,57 +187,43 @@
       <w:tr>
         <w:tc>
           <w:tcPr>
-            <w:tcW w:type="dxa" w:w="1531"/>
-          </w:tcPr>
-          <w:p>
-            <w:r/>
-            <w:r>
-              <w:rPr>
-                <w:sz w:val="18"/>
-              </w:rPr>
-              <w:t>IV.1</w:t>
-            </w:r>
-          </w:p>
-        </w:tc>
-        <w:tc>
-          <w:tcPr>
-            <w:tcW w:type="dxa" w:w="2835"/>
-          </w:tcPr>
-          <w:p>
-            <w:r/>
-            <w:r>
-              <w:rPr>
-                <w:sz w:val="18"/>
-              </w:rPr>
-              <w:t>Faux plafond Hygiène Performance A</w:t>
-            </w:r>
-          </w:p>
-        </w:tc>
-        <w:tc>
-          <w:tcPr>
-            <w:tcW w:type="dxa" w:w="3572"/>
-          </w:tcPr>
-          <w:p>
-            <w:r/>
-            <w:r>
-              <w:rPr>
-                <w:sz w:val="18"/>
-              </w:rPr>
-              <w:t>Akutex HS — dalle 600x600, ép. 20mm, classt A</w:t>
-            </w:r>
-          </w:p>
-        </w:tc>
-        <w:tc>
-          <w:tcPr>
-            <w:tcW w:type="dxa" w:w="1417"/>
-          </w:tcPr>
-          <w:p>
-            <w:r/>
-            <w:r>
-              <w:rPr>
-                <w:sz w:val="18"/>
-              </w:rPr>
-              <w:t>ECOPHON</w:t>
+            <w:tcW w:type="dxa" w:w="1304"/>
+          </w:tcPr>
+          <w:p>
+            <w:r/>
+            <w:r>
+              <w:rPr>
+                <w:sz w:val="18"/>
+              </w:rPr>
+              <w:t>IV.3</w:t>
+            </w:r>
+          </w:p>
+        </w:tc>
+        <w:tc>
+          <w:tcPr>
+            <w:tcW w:type="dxa" w:w="5499"/>
+          </w:tcPr>
+          <w:p>
+            <w:r/>
+            <w:r>
+              <w:rPr>
+                <w:sz w:val="18"/>
+              </w:rPr>
+              <w:t>Placoplâtre BA 13 (plaque de jouées)</w:t>
+            </w:r>
+          </w:p>
+        </w:tc>
+        <w:tc>
+          <w:tcPr>
+            <w:tcW w:type="dxa" w:w="1984"/>
+          </w:tcPr>
+          <w:p>
+            <w:r/>
+            <w:r>
+              <w:rPr>
+                <w:sz w:val="18"/>
+              </w:rPr>
+              <w:t>PLACO — SAINT-GOBAIN</w:t>
             </w:r>
           </w:p>
         </w:tc>
@@ -249,57 +231,43 @@
       <w:tr>
         <w:tc>
           <w:tcPr>
-            <w:tcW w:type="dxa" w:w="1531"/>
-          </w:tcPr>
-          <w:p>
-            <w:r/>
-            <w:r>
-              <w:rPr>
-                <w:sz w:val="18"/>
-              </w:rPr>
-              <w:t>IV.1 / IV.2</w:t>
-            </w:r>
-          </w:p>
-        </w:tc>
-        <w:tc>
-          <w:tcPr>
-            <w:tcW w:type="dxa" w:w="2835"/>
-          </w:tcPr>
-          <w:p>
-            <w:r/>
-            <w:r>
-              <w:rPr>
-                <w:sz w:val="18"/>
-              </w:rPr>
-              <w:t>Ossature de faux plafond</w:t>
-            </w:r>
-          </w:p>
-        </w:tc>
-        <w:tc>
-          <w:tcPr>
-            <w:tcW w:type="dxa" w:w="3572"/>
-          </w:tcPr>
-          <w:p>
-            <w:r/>
-            <w:r>
-              <w:rPr>
-                <w:sz w:val="18"/>
-              </w:rPr>
-              <w:t>Profil T24 Connect C3 + suspentes réglables</w:t>
-            </w:r>
-          </w:p>
-        </w:tc>
-        <w:tc>
-          <w:tcPr>
-            <w:tcW w:type="dxa" w:w="1417"/>
-          </w:tcPr>
-          <w:p>
-            <w:r/>
-            <w:r>
-              <w:rPr>
-                <w:sz w:val="18"/>
-              </w:rPr>
-              <w:t>ECOPHON</w:t>
+            <w:tcW w:type="dxa" w:w="1304"/>
+          </w:tcPr>
+          <w:p>
+            <w:r/>
+            <w:r>
+              <w:rPr>
+                <w:sz w:val="18"/>
+              </w:rPr>
+              <w:t>IV.3</w:t>
+            </w:r>
+          </w:p>
+        </w:tc>
+        <w:tc>
+          <w:tcPr>
+            <w:tcW w:type="dxa" w:w="5499"/>
+          </w:tcPr>
+          <w:p>
+            <w:r/>
+            <w:r>
+              <w:rPr>
+                <w:sz w:val="18"/>
+              </w:rPr>
+              <w:t>Ossature de jouées — Montant Stil R48 + Stil M48</w:t>
+            </w:r>
+          </w:p>
+        </w:tc>
+        <w:tc>
+          <w:tcPr>
+            <w:tcW w:type="dxa" w:w="1984"/>
+          </w:tcPr>
+          <w:p>
+            <w:r/>
+            <w:r>
+              <w:rPr>
+                <w:sz w:val="18"/>
+              </w:rPr>
+              <w:t>PLACO — SAINT-GOBAIN</w:t>
             </w:r>
           </w:p>
         </w:tc>
@@ -307,57 +275,43 @@
       <w:tr>
         <w:tc>
           <w:tcPr>
-            <w:tcW w:type="dxa" w:w="1531"/>
-          </w:tcPr>
-          <w:p>
-            <w:r/>
-            <w:r>
-              <w:rPr>
-                <w:sz w:val="18"/>
-              </w:rPr>
-              <w:t>IV.2</w:t>
-            </w:r>
-          </w:p>
-        </w:tc>
-        <w:tc>
-          <w:tcPr>
-            <w:tcW w:type="dxa" w:w="2835"/>
-          </w:tcPr>
-          <w:p>
-            <w:r/>
-            <w:r>
-              <w:rPr>
-                <w:sz w:val="18"/>
-              </w:rPr>
-              <w:t>Faux plafond Hygiène Protect Air A</w:t>
-            </w:r>
-          </w:p>
-        </w:tc>
-        <w:tc>
-          <w:tcPr>
-            <w:tcW w:type="dxa" w:w="3572"/>
-          </w:tcPr>
-          <w:p>
-            <w:r/>
-            <w:r>
-              <w:rPr>
-                <w:sz w:val="18"/>
-              </w:rPr>
-              <w:t>Akutex HP — dalle 600x600, ép. 20mm, classt B</w:t>
-            </w:r>
-          </w:p>
-        </w:tc>
-        <w:tc>
-          <w:tcPr>
-            <w:tcW w:type="dxa" w:w="1417"/>
-          </w:tcPr>
-          <w:p>
-            <w:r/>
-            <w:r>
-              <w:rPr>
-                <w:sz w:val="18"/>
-              </w:rPr>
-              <w:t>ECOPHON</w:t>
+            <w:tcW w:type="dxa" w:w="1304"/>
+          </w:tcPr>
+          <w:p>
+            <w:r/>
+            <w:r>
+              <w:rPr>
+                <w:sz w:val="18"/>
+              </w:rPr>
+              <w:t>IV.3</w:t>
+            </w:r>
+          </w:p>
+        </w:tc>
+        <w:tc>
+          <w:tcPr>
+            <w:tcW w:type="dxa" w:w="5499"/>
+          </w:tcPr>
+          <w:p>
+            <w:r/>
+            <w:r>
+              <w:rPr>
+                <w:sz w:val="18"/>
+              </w:rPr>
+              <w:t>Fixation des plaques — Vis TTPC 25</w:t>
+            </w:r>
+          </w:p>
+        </w:tc>
+        <w:tc>
+          <w:tcPr>
+            <w:tcW w:type="dxa" w:w="1984"/>
+          </w:tcPr>
+          <w:p>
+            <w:r/>
+            <w:r>
+              <w:rPr>
+                <w:sz w:val="18"/>
+              </w:rPr>
+              <w:t>PLACO — SAINT-GOBAIN</w:t>
             </w:r>
           </w:p>
         </w:tc>
@@ -365,7 +319,7 @@
       <w:tr>
         <w:tc>
           <w:tcPr>
-            <w:tcW w:type="dxa" w:w="1531"/>
+            <w:tcW w:type="dxa" w:w="1304"/>
           </w:tcPr>
           <w:p>
             <w:r/>
@@ -379,43 +333,29 @@
         </w:tc>
         <w:tc>
           <w:tcPr>
-            <w:tcW w:type="dxa" w:w="2835"/>
-          </w:tcPr>
-          <w:p>
-            <w:r/>
-            <w:r>
-              <w:rPr>
-                <w:sz w:val="18"/>
-              </w:rPr>
-              <w:t>Jouées (BA13)</w:t>
-            </w:r>
-          </w:p>
-        </w:tc>
-        <w:tc>
-          <w:tcPr>
-            <w:tcW w:type="dxa" w:w="3572"/>
-          </w:tcPr>
-          <w:p>
-            <w:r/>
-            <w:r>
-              <w:rPr>
-                <w:sz w:val="18"/>
-              </w:rPr>
-              <w:t>Plaque de plâtre BA13 sur ossature</w:t>
-            </w:r>
-          </w:p>
-        </w:tc>
-        <w:tc>
-          <w:tcPr>
-            <w:tcW w:type="dxa" w:w="1417"/>
-          </w:tcPr>
-          <w:p>
-            <w:r/>
-            <w:r>
-              <w:rPr>
-                <w:sz w:val="18"/>
-              </w:rPr>
-              <w:t>PLACOSTIL</w:t>
+            <w:tcW w:type="dxa" w:w="5499"/>
+          </w:tcPr>
+          <w:p>
+            <w:r/>
+            <w:r>
+              <w:rPr>
+                <w:sz w:val="18"/>
+              </w:rPr>
+              <w:t>Traitement des joints — Placojoint PR4</w:t>
+            </w:r>
+          </w:p>
+        </w:tc>
+        <w:tc>
+          <w:tcPr>
+            <w:tcW w:type="dxa" w:w="1984"/>
+          </w:tcPr>
+          <w:p>
+            <w:r/>
+            <w:r>
+              <w:rPr>
+                <w:sz w:val="18"/>
+              </w:rPr>
+              <w:t>PLACO — SAINT-GOBAIN</w:t>
             </w:r>
           </w:p>
         </w:tc>
@@ -423,57 +363,43 @@
       <w:tr>
         <w:tc>
           <w:tcPr>
-            <w:tcW w:type="dxa" w:w="1531"/>
-          </w:tcPr>
-          <w:p>
-            <w:r/>
-            <w:r>
-              <w:rPr>
-                <w:sz w:val="18"/>
-              </w:rPr>
-              <w:t>IV.4</w:t>
-            </w:r>
-          </w:p>
-        </w:tc>
-        <w:tc>
-          <w:tcPr>
-            <w:tcW w:type="dxa" w:w="2835"/>
-          </w:tcPr>
-          <w:p>
-            <w:r/>
-            <w:r>
-              <w:rPr>
-                <w:sz w:val="18"/>
-              </w:rPr>
-              <w:t>Grilles de ventilation plénum</w:t>
-            </w:r>
-          </w:p>
-        </w:tc>
-        <w:tc>
-          <w:tcPr>
-            <w:tcW w:type="dxa" w:w="3572"/>
-          </w:tcPr>
-          <w:p>
-            <w:r/>
-            <w:r>
-              <w:rPr>
-                <w:sz w:val="18"/>
-              </w:rPr>
-              <w:t>Grille aluminium laqué</w:t>
-            </w:r>
-          </w:p>
-        </w:tc>
-        <w:tc>
-          <w:tcPr>
-            <w:tcW w:type="dxa" w:w="1417"/>
-          </w:tcPr>
-          <w:p>
-            <w:r/>
-            <w:r>
-              <w:rPr>
-                <w:sz w:val="18"/>
-              </w:rPr>
-              <w:t>—</w:t>
+            <w:tcW w:type="dxa" w:w="1304"/>
+          </w:tcPr>
+          <w:p>
+            <w:r/>
+            <w:r>
+              <w:rPr>
+                <w:sz w:val="18"/>
+              </w:rPr>
+              <w:t>IV.3</w:t>
+            </w:r>
+          </w:p>
+        </w:tc>
+        <w:tc>
+          <w:tcPr>
+            <w:tcW w:type="dxa" w:w="5499"/>
+          </w:tcPr>
+          <w:p>
+            <w:r/>
+            <w:r>
+              <w:rPr>
+                <w:sz w:val="18"/>
+              </w:rPr>
+              <w:t>Bande à joints — Bande PP grand rouleau</w:t>
+            </w:r>
+          </w:p>
+        </w:tc>
+        <w:tc>
+          <w:tcPr>
+            <w:tcW w:type="dxa" w:w="1984"/>
+          </w:tcPr>
+          <w:p>
+            <w:r/>
+            <w:r>
+              <w:rPr>
+                <w:sz w:val="18"/>
+              </w:rPr>
+              <w:t>PLACO — SAINT-GOBAIN</w:t>
             </w:r>
           </w:p>
         </w:tc>
@@ -481,57 +407,43 @@
       <w:tr>
         <w:tc>
           <w:tcPr>
-            <w:tcW w:type="dxa" w:w="1531"/>
-          </w:tcPr>
-          <w:p>
-            <w:r/>
-            <w:r>
-              <w:rPr>
-                <w:sz w:val="18"/>
-              </w:rPr>
-              <w:t>III.3.02 / IV.6.02</w:t>
-            </w:r>
-          </w:p>
-        </w:tc>
-        <w:tc>
-          <w:tcPr>
-            <w:tcW w:type="dxa" w:w="2835"/>
-          </w:tcPr>
-          <w:p>
-            <w:r/>
-            <w:r>
-              <w:rPr>
-                <w:sz w:val="18"/>
-              </w:rPr>
-              <w:t>Impression murs (vieux fonds et plâtre/cartonné)</w:t>
-            </w:r>
-          </w:p>
-        </w:tc>
-        <w:tc>
-          <w:tcPr>
-            <w:tcW w:type="dxa" w:w="3572"/>
-          </w:tcPr>
-          <w:p>
-            <w:r/>
-            <w:r>
-              <w:rPr>
-                <w:sz w:val="18"/>
-              </w:rPr>
-              <w:t>Indeko Fix — phase aqueuse, faible C.O.V., Ecolabel</w:t>
-            </w:r>
-          </w:p>
-        </w:tc>
-        <w:tc>
-          <w:tcPr>
-            <w:tcW w:type="dxa" w:w="1417"/>
-          </w:tcPr>
-          <w:p>
-            <w:r/>
-            <w:r>
-              <w:rPr>
-                <w:sz w:val="18"/>
-              </w:rPr>
-              <w:t>CAPAROL</w:t>
+            <w:tcW w:type="dxa" w:w="1304"/>
+          </w:tcPr>
+          <w:p>
+            <w:r/>
+            <w:r>
+              <w:rPr>
+                <w:sz w:val="18"/>
+              </w:rPr>
+              <w:t>IV.1</w:t>
+            </w:r>
+          </w:p>
+        </w:tc>
+        <w:tc>
+          <w:tcPr>
+            <w:tcW w:type="dxa" w:w="5499"/>
+          </w:tcPr>
+          <w:p>
+            <w:r/>
+            <w:r>
+              <w:rPr>
+                <w:sz w:val="18"/>
+              </w:rPr>
+              <w:t>Faux plafond Hygiène Performance A — Akutex HS (600x600, 20mm, classt A)</w:t>
+            </w:r>
+          </w:p>
+        </w:tc>
+        <w:tc>
+          <w:tcPr>
+            <w:tcW w:type="dxa" w:w="1984"/>
+          </w:tcPr>
+          <w:p>
+            <w:r/>
+            <w:r>
+              <w:rPr>
+                <w:sz w:val="18"/>
+              </w:rPr>
+              <w:t>ECOPHON — SAINT-GOBAIN</w:t>
             </w:r>
           </w:p>
         </w:tc>
@@ -539,57 +451,43 @@
       <w:tr>
         <w:tc>
           <w:tcPr>
-            <w:tcW w:type="dxa" w:w="1531"/>
-          </w:tcPr>
-          <w:p>
-            <w:r/>
-            <w:r>
-              <w:rPr>
-                <w:sz w:val="18"/>
-              </w:rPr>
-              <w:t>III.3.02 / IV.6.02</w:t>
-            </w:r>
-          </w:p>
-        </w:tc>
-        <w:tc>
-          <w:tcPr>
-            <w:tcW w:type="dxa" w:w="2835"/>
-          </w:tcPr>
-          <w:p>
-            <w:r/>
-            <w:r>
-              <w:rPr>
-                <w:sz w:val="18"/>
-              </w:rPr>
-              <w:t>Finition peinture murs</w:t>
-            </w:r>
-          </w:p>
-        </w:tc>
-        <w:tc>
-          <w:tcPr>
-            <w:tcW w:type="dxa" w:w="3572"/>
-          </w:tcPr>
-          <w:p>
-            <w:r/>
-            <w:r>
-              <w:rPr>
-                <w:sz w:val="18"/>
-              </w:rPr>
-              <w:t>Indeko Satin — finition A, faible C.O.V., Ecolabel</w:t>
-            </w:r>
-          </w:p>
-        </w:tc>
-        <w:tc>
-          <w:tcPr>
-            <w:tcW w:type="dxa" w:w="1417"/>
-          </w:tcPr>
-          <w:p>
-            <w:r/>
-            <w:r>
-              <w:rPr>
-                <w:sz w:val="18"/>
-              </w:rPr>
-              <w:t>CAPAROL</w:t>
+            <w:tcW w:type="dxa" w:w="1304"/>
+          </w:tcPr>
+          <w:p>
+            <w:r/>
+            <w:r>
+              <w:rPr>
+                <w:sz w:val="18"/>
+              </w:rPr>
+              <w:t>IV.1</w:t>
+            </w:r>
+          </w:p>
+        </w:tc>
+        <w:tc>
+          <w:tcPr>
+            <w:tcW w:type="dxa" w:w="5499"/>
+          </w:tcPr>
+          <w:p>
+            <w:r/>
+            <w:r>
+              <w:rPr>
+                <w:sz w:val="18"/>
+              </w:rPr>
+              <w:t>Système d'ossature Hygiène Performance A (profil T24 Connect C3, suspentes)</w:t>
+            </w:r>
+          </w:p>
+        </w:tc>
+        <w:tc>
+          <w:tcPr>
+            <w:tcW w:type="dxa" w:w="1984"/>
+          </w:tcPr>
+          <w:p>
+            <w:r/>
+            <w:r>
+              <w:rPr>
+                <w:sz w:val="18"/>
+              </w:rPr>
+              <w:t>ECOPHON — SAINT-GOBAIN</w:t>
             </w:r>
           </w:p>
         </w:tc>
@@ -597,57 +495,43 @@
       <w:tr>
         <w:tc>
           <w:tcPr>
-            <w:tcW w:type="dxa" w:w="1531"/>
-          </w:tcPr>
-          <w:p>
-            <w:r/>
-            <w:r>
-              <w:rPr>
-                <w:sz w:val="18"/>
-              </w:rPr>
-              <w:t>IV.6.01 / IV.6.03 / IV.6.04 / IV.6.05</w:t>
-            </w:r>
-          </w:p>
-        </w:tc>
-        <w:tc>
-          <w:tcPr>
-            <w:tcW w:type="dxa" w:w="2835"/>
-          </w:tcPr>
-          <w:p>
-            <w:r/>
-            <w:r>
-              <w:rPr>
-                <w:sz w:val="18"/>
-              </w:rPr>
-              <w:t>Peinture plafonds, boiseries, métaux, PVC</w:t>
-            </w:r>
-          </w:p>
-        </w:tc>
-        <w:tc>
-          <w:tcPr>
-            <w:tcW w:type="dxa" w:w="3572"/>
-          </w:tcPr>
-          <w:p>
-            <w:r/>
-            <w:r>
-              <w:rPr>
-                <w:sz w:val="18"/>
-              </w:rPr>
-              <w:t>Peinture satinée glycérophtalique — finitions A/B</w:t>
-            </w:r>
-          </w:p>
-        </w:tc>
-        <w:tc>
-          <w:tcPr>
-            <w:tcW w:type="dxa" w:w="1417"/>
-          </w:tcPr>
-          <w:p>
-            <w:r/>
-            <w:r>
-              <w:rPr>
-                <w:sz w:val="18"/>
-              </w:rPr>
-              <w:t>—</w:t>
+            <w:tcW w:type="dxa" w:w="1304"/>
+          </w:tcPr>
+          <w:p>
+            <w:r/>
+            <w:r>
+              <w:rPr>
+                <w:sz w:val="18"/>
+              </w:rPr>
+              <w:t>IV.2</w:t>
+            </w:r>
+          </w:p>
+        </w:tc>
+        <w:tc>
+          <w:tcPr>
+            <w:tcW w:type="dxa" w:w="5499"/>
+          </w:tcPr>
+          <w:p>
+            <w:r/>
+            <w:r>
+              <w:rPr>
+                <w:sz w:val="18"/>
+              </w:rPr>
+              <w:t>Faux plafond Hygiène Protect Air A — Akutex HP (600x600, 20mm, classt B)</w:t>
+            </w:r>
+          </w:p>
+        </w:tc>
+        <w:tc>
+          <w:tcPr>
+            <w:tcW w:type="dxa" w:w="1984"/>
+          </w:tcPr>
+          <w:p>
+            <w:r/>
+            <w:r>
+              <w:rPr>
+                <w:sz w:val="18"/>
+              </w:rPr>
+              <w:t>ECOPHON — SAINT-GOBAIN</w:t>
             </w:r>
           </w:p>
         </w:tc>
@@ -655,57 +539,43 @@
       <w:tr>
         <w:tc>
           <w:tcPr>
-            <w:tcW w:type="dxa" w:w="1531"/>
-          </w:tcPr>
-          <w:p>
-            <w:r/>
-            <w:r>
-              <w:rPr>
-                <w:sz w:val="18"/>
-              </w:rPr>
-              <w:t>IV.8.01</w:t>
-            </w:r>
-          </w:p>
-        </w:tc>
-        <w:tc>
-          <w:tcPr>
-            <w:tcW w:type="dxa" w:w="2835"/>
-          </w:tcPr>
-          <w:p>
-            <w:r/>
-            <w:r>
-              <w:rPr>
-                <w:sz w:val="18"/>
-              </w:rPr>
-              <w:t>Ragréage des aires de pose</w:t>
-            </w:r>
-          </w:p>
-        </w:tc>
-        <w:tc>
-          <w:tcPr>
-            <w:tcW w:type="dxa" w:w="3572"/>
-          </w:tcPr>
-          <w:p>
-            <w:r/>
-            <w:r>
-              <w:rPr>
-                <w:sz w:val="18"/>
-              </w:rPr>
-              <w:t>Nivdur S (classt P.3, ép. ≥3mm)</w:t>
-            </w:r>
-          </w:p>
-        </w:tc>
-        <w:tc>
-          <w:tcPr>
-            <w:tcW w:type="dxa" w:w="1417"/>
-          </w:tcPr>
-          <w:p>
-            <w:r/>
-            <w:r>
-              <w:rPr>
-                <w:sz w:val="18"/>
-              </w:rPr>
-              <w:t>WEBER &amp; BROUTIN</w:t>
+            <w:tcW w:type="dxa" w:w="1304"/>
+          </w:tcPr>
+          <w:p>
+            <w:r/>
+            <w:r>
+              <w:rPr>
+                <w:sz w:val="18"/>
+              </w:rPr>
+              <w:t>IV.2</w:t>
+            </w:r>
+          </w:p>
+        </w:tc>
+        <w:tc>
+          <w:tcPr>
+            <w:tcW w:type="dxa" w:w="5499"/>
+          </w:tcPr>
+          <w:p>
+            <w:r/>
+            <w:r>
+              <w:rPr>
+                <w:sz w:val="18"/>
+              </w:rPr>
+              <w:t>Système d'ossature Hygiène Protect Air A</w:t>
+            </w:r>
+          </w:p>
+        </w:tc>
+        <w:tc>
+          <w:tcPr>
+            <w:tcW w:type="dxa" w:w="1984"/>
+          </w:tcPr>
+          <w:p>
+            <w:r/>
+            <w:r>
+              <w:rPr>
+                <w:sz w:val="18"/>
+              </w:rPr>
+              <w:t>ECOPHON — SAINT-GOBAIN</w:t>
             </w:r>
           </w:p>
         </w:tc>
@@ -713,57 +583,43 @@
       <w:tr>
         <w:tc>
           <w:tcPr>
-            <w:tcW w:type="dxa" w:w="1531"/>
-          </w:tcPr>
-          <w:p>
-            <w:r/>
-            <w:r>
-              <w:rPr>
-                <w:sz w:val="18"/>
-              </w:rPr>
-              <w:t>IV.8.01</w:t>
-            </w:r>
-          </w:p>
-        </w:tc>
-        <w:tc>
-          <w:tcPr>
-            <w:tcW w:type="dxa" w:w="2835"/>
-          </w:tcPr>
-          <w:p>
-            <w:r/>
-            <w:r>
-              <w:rPr>
-                <w:sz w:val="18"/>
-              </w:rPr>
-              <w:t>Rattrapage de niveaux importants</w:t>
-            </w:r>
-          </w:p>
-        </w:tc>
-        <w:tc>
-          <w:tcPr>
-            <w:tcW w:type="dxa" w:w="3572"/>
-          </w:tcPr>
-          <w:p>
-            <w:r/>
-            <w:r>
-              <w:rPr>
-                <w:sz w:val="18"/>
-              </w:rPr>
-              <w:t>CEGECOL PE + primaire d'accrochage</w:t>
-            </w:r>
-          </w:p>
-        </w:tc>
-        <w:tc>
-          <w:tcPr>
-            <w:tcW w:type="dxa" w:w="1417"/>
-          </w:tcPr>
-          <w:p>
-            <w:r/>
-            <w:r>
-              <w:rPr>
-                <w:sz w:val="18"/>
-              </w:rPr>
-              <w:t>—</w:t>
+            <w:tcW w:type="dxa" w:w="1304"/>
+          </w:tcPr>
+          <w:p>
+            <w:r/>
+            <w:r>
+              <w:rPr>
+                <w:sz w:val="18"/>
+              </w:rPr>
+              <w:t>IV.1 / IV.2</w:t>
+            </w:r>
+          </w:p>
+        </w:tc>
+        <w:tc>
+          <w:tcPr>
+            <w:tcW w:type="dxa" w:w="5499"/>
+          </w:tcPr>
+          <w:p>
+            <w:r/>
+            <w:r>
+              <w:rPr>
+                <w:sz w:val="18"/>
+              </w:rPr>
+              <w:t>Trappe de visite — Connect Inspection Hatch C3, 600x600mm</w:t>
+            </w:r>
+          </w:p>
+        </w:tc>
+        <w:tc>
+          <w:tcPr>
+            <w:tcW w:type="dxa" w:w="1984"/>
+          </w:tcPr>
+          <w:p>
+            <w:r/>
+            <w:r>
+              <w:rPr>
+                <w:sz w:val="18"/>
+              </w:rPr>
+              <w:t>ECOPHON</w:t>
             </w:r>
           </w:p>
         </w:tc>
@@ -771,295 +627,1057 @@
       <w:tr>
         <w:tc>
           <w:tcPr>
-            <w:tcW w:type="dxa" w:w="1531"/>
-          </w:tcPr>
-          <w:p>
-            <w:r/>
-            <w:r>
-              <w:rPr>
-                <w:sz w:val="18"/>
-              </w:rPr>
-              <w:t>IV.8.03</w:t>
-            </w:r>
-          </w:p>
-        </w:tc>
-        <w:tc>
-          <w:tcPr>
-            <w:tcW w:type="dxa" w:w="2835"/>
-          </w:tcPr>
-          <w:p>
-            <w:r/>
-            <w:r>
-              <w:rPr>
-                <w:sz w:val="18"/>
-              </w:rPr>
-              <w:t>Sol PVC compact imprimé</w:t>
-            </w:r>
-          </w:p>
-        </w:tc>
-        <w:tc>
-          <w:tcPr>
-            <w:tcW w:type="dxa" w:w="3572"/>
-          </w:tcPr>
-          <w:p>
-            <w:r/>
-            <w:r>
-              <w:rPr>
-                <w:sz w:val="18"/>
-              </w:rPr>
-              <w:t>Taralay Impression Compact — 2,00mm, UPEC U3P3E2/3C2</w:t>
-            </w:r>
-          </w:p>
-        </w:tc>
-        <w:tc>
-          <w:tcPr>
-            <w:tcW w:type="dxa" w:w="1417"/>
-          </w:tcPr>
-          <w:p>
-            <w:r/>
-            <w:r>
-              <w:rPr>
-                <w:sz w:val="18"/>
-              </w:rPr>
-              <w:t>GERFLOR</w:t>
-            </w:r>
-          </w:p>
-        </w:tc>
-      </w:tr>
-      <w:tr>
-        <w:tc>
-          <w:tcPr>
-            <w:tcW w:type="dxa" w:w="1531"/>
-          </w:tcPr>
-          <w:p>
-            <w:r/>
-            <w:r>
-              <w:rPr>
-                <w:sz w:val="18"/>
-              </w:rPr>
-              <w:t>IV.8.04</w:t>
-            </w:r>
-          </w:p>
-        </w:tc>
-        <w:tc>
-          <w:tcPr>
-            <w:tcW w:type="dxa" w:w="2835"/>
-          </w:tcPr>
-          <w:p>
-            <w:r/>
-            <w:r>
-              <w:rPr>
-                <w:sz w:val="18"/>
-              </w:rPr>
-              <w:t>Sol homogène compact</w:t>
-            </w:r>
-          </w:p>
-        </w:tc>
-        <w:tc>
-          <w:tcPr>
-            <w:tcW w:type="dxa" w:w="3572"/>
-          </w:tcPr>
-          <w:p>
-            <w:r/>
-            <w:r>
-              <w:rPr>
-                <w:sz w:val="18"/>
-              </w:rPr>
-              <w:t>Taralay Mipolam Planet — 2,00mm, UPEC U3P3E2/3C2</w:t>
-            </w:r>
-          </w:p>
-        </w:tc>
-        <w:tc>
-          <w:tcPr>
-            <w:tcW w:type="dxa" w:w="1417"/>
-          </w:tcPr>
-          <w:p>
-            <w:r/>
-            <w:r>
-              <w:rPr>
-                <w:sz w:val="18"/>
-              </w:rPr>
-              <w:t>GERFLOR</w:t>
-            </w:r>
-          </w:p>
-        </w:tc>
-      </w:tr>
-      <w:tr>
-        <w:tc>
-          <w:tcPr>
-            <w:tcW w:type="dxa" w:w="1531"/>
-          </w:tcPr>
-          <w:p>
-            <w:r/>
-            <w:r>
-              <w:rPr>
-                <w:sz w:val="18"/>
-              </w:rPr>
-              <w:t>IV.8.03 / IV.8.04</w:t>
-            </w:r>
-          </w:p>
-        </w:tc>
-        <w:tc>
-          <w:tcPr>
-            <w:tcW w:type="dxa" w:w="2835"/>
-          </w:tcPr>
-          <w:p>
-            <w:r/>
-            <w:r>
-              <w:rPr>
-                <w:sz w:val="18"/>
-              </w:rPr>
-              <w:t>Plinthes rapportées</w:t>
-            </w:r>
-          </w:p>
-        </w:tc>
-        <w:tc>
-          <w:tcPr>
-            <w:tcW w:type="dxa" w:w="3572"/>
-          </w:tcPr>
-          <w:p>
-            <w:r/>
-            <w:r>
-              <w:rPr>
-                <w:sz w:val="18"/>
-              </w:rPr>
-              <w:t>Profil réf. 0488, remontée 0,10m</w:t>
-            </w:r>
-          </w:p>
-        </w:tc>
-        <w:tc>
-          <w:tcPr>
-            <w:tcW w:type="dxa" w:w="1417"/>
-          </w:tcPr>
-          <w:p>
-            <w:r/>
-            <w:r>
-              <w:rPr>
-                <w:sz w:val="18"/>
-              </w:rPr>
-              <w:t>GERFLOR</w:t>
-            </w:r>
-          </w:p>
-        </w:tc>
-      </w:tr>
-      <w:tr>
-        <w:tc>
-          <w:tcPr>
-            <w:tcW w:type="dxa" w:w="1531"/>
-          </w:tcPr>
-          <w:p>
-            <w:r/>
-            <w:r>
-              <w:rPr>
-                <w:sz w:val="18"/>
-              </w:rPr>
-              <w:t>IV.8.05</w:t>
-            </w:r>
-          </w:p>
-        </w:tc>
-        <w:tc>
-          <w:tcPr>
-            <w:tcW w:type="dxa" w:w="2835"/>
-          </w:tcPr>
-          <w:p>
-            <w:r/>
-            <w:r>
-              <w:rPr>
-                <w:sz w:val="18"/>
-              </w:rPr>
-              <w:t>Barres de seuil</w:t>
-            </w:r>
-          </w:p>
-        </w:tc>
-        <w:tc>
-          <w:tcPr>
-            <w:tcW w:type="dxa" w:w="3572"/>
-          </w:tcPr>
-          <w:p>
-            <w:r/>
-            <w:r>
-              <w:rPr>
-                <w:sz w:val="18"/>
-              </w:rPr>
-              <w:t>Barre laiton semi-bombée, 35mm</w:t>
-            </w:r>
-          </w:p>
-        </w:tc>
-        <w:tc>
-          <w:tcPr>
-            <w:tcW w:type="dxa" w:w="1417"/>
-          </w:tcPr>
-          <w:p>
-            <w:r/>
-            <w:r>
-              <w:rPr>
-                <w:sz w:val="18"/>
-              </w:rPr>
-              <w:t>—</w:t>
-            </w:r>
-          </w:p>
-        </w:tc>
-      </w:tr>
-      <w:tr>
-        <w:tc>
-          <w:tcPr>
-            <w:tcW w:type="dxa" w:w="1531"/>
-          </w:tcPr>
-          <w:p>
-            <w:r/>
-            <w:r>
-              <w:rPr>
-                <w:sz w:val="18"/>
-              </w:rPr>
-              <w:t>IV.8.02</w:t>
-            </w:r>
-          </w:p>
-        </w:tc>
-        <w:tc>
-          <w:tcPr>
-            <w:tcW w:type="dxa" w:w="2835"/>
-          </w:tcPr>
-          <w:p>
-            <w:r/>
-            <w:r>
-              <w:rPr>
-                <w:sz w:val="18"/>
-              </w:rPr>
-              <w:t>Colles de pose</w:t>
-            </w:r>
-          </w:p>
-        </w:tc>
-        <w:tc>
-          <w:tcPr>
-            <w:tcW w:type="dxa" w:w="3572"/>
-          </w:tcPr>
-          <w:p>
-            <w:r/>
-            <w:r>
-              <w:rPr>
-                <w:sz w:val="18"/>
-              </w:rPr>
-              <w:t>Colle compatible revêtement/support (selon préco. fabricant)</w:t>
-            </w:r>
-          </w:p>
-        </w:tc>
-        <w:tc>
-          <w:tcPr>
-            <w:tcW w:type="dxa" w:w="1417"/>
-          </w:tcPr>
-          <w:p>
-            <w:r/>
-            <w:r>
-              <w:rPr>
-                <w:sz w:val="18"/>
-              </w:rPr>
-              <w:t>—</w:t>
+            <w:tcW w:type="dxa" w:w="1304"/>
+          </w:tcPr>
+          <w:p>
+            <w:r/>
+            <w:r>
+              <w:rPr>
+                <w:sz w:val="18"/>
+              </w:rPr>
+              <w:t>IV.4</w:t>
+            </w:r>
+          </w:p>
+        </w:tc>
+        <w:tc>
+          <w:tcPr>
+            <w:tcW w:type="dxa" w:w="5499"/>
+          </w:tcPr>
+          <w:p>
+            <w:r/>
+            <w:r>
+              <w:rPr>
+                <w:sz w:val="18"/>
+              </w:rPr>
+              <w:t>Grille de ventilation des plénums — LAC 30, aluminium laqué blanc RAL 9003 mat</w:t>
+            </w:r>
+          </w:p>
+        </w:tc>
+        <w:tc>
+          <w:tcPr>
+            <w:tcW w:type="dxa" w:w="1984"/>
+          </w:tcPr>
+          <w:p>
+            <w:r/>
+            <w:r>
+              <w:rPr>
+                <w:sz w:val="18"/>
+              </w:rPr>
+              <w:t>FRANCE AIR</w:t>
             </w:r>
           </w:p>
         </w:tc>
       </w:tr>
     </w:tbl>
     <w:p/>
+    <w:p>
+      <w:pPr>
+        <w:spacing w:before="160" w:after="60"/>
+      </w:pPr>
+      <w:r>
+        <w:rPr>
+          <w:b/>
+          <w:i/>
+          <w:color w:val="2E74B5"/>
+          <w:sz w:val="21"/>
+        </w:rPr>
+        <w:t>Sols souples</w:t>
+      </w:r>
+    </w:p>
+    <w:tbl>
+      <w:tblPr>
+        <w:tblStyle w:val="TableGrid"/>
+        <w:tblW w:type="auto" w:w="0"/>
+        <w:jc w:val="center"/>
+        <w:tblLook w:firstColumn="1" w:firstRow="1" w:lastColumn="0" w:lastRow="0" w:noHBand="0" w:noVBand="1" w:val="04A0"/>
+      </w:tblPr>
+      <w:tblGrid>
+        <w:gridCol w:w="3324"/>
+        <w:gridCol w:w="3324"/>
+        <w:gridCol w:w="3324"/>
+      </w:tblGrid>
+      <w:tr>
+        <w:tc>
+          <w:tcPr>
+            <w:tcW w:type="dxa" w:w="1304"/>
+            <w:shd w:val="clear" w:color="auto" w:fill="2E74B5"/>
+          </w:tcPr>
+          <w:p>
+            <w:r/>
+            <w:r>
+              <w:rPr>
+                <w:b/>
+                <w:color w:val="FFFFFF"/>
+                <w:sz w:val="18"/>
+              </w:rPr>
+              <w:t>Art. CCTP</w:t>
+            </w:r>
+          </w:p>
+        </w:tc>
+        <w:tc>
+          <w:tcPr>
+            <w:tcW w:type="dxa" w:w="5499"/>
+            <w:shd w:val="clear" w:color="auto" w:fill="2E74B5"/>
+          </w:tcPr>
+          <w:p>
+            <w:r/>
+            <w:r>
+              <w:rPr>
+                <w:b/>
+                <w:color w:val="FFFFFF"/>
+                <w:sz w:val="18"/>
+              </w:rPr>
+              <w:t>Produit (fiche technique)</w:t>
+            </w:r>
+          </w:p>
+        </w:tc>
+        <w:tc>
+          <w:tcPr>
+            <w:tcW w:type="dxa" w:w="1984"/>
+            <w:shd w:val="clear" w:color="auto" w:fill="2E74B5"/>
+          </w:tcPr>
+          <w:p>
+            <w:r/>
+            <w:r>
+              <w:rPr>
+                <w:b/>
+                <w:color w:val="FFFFFF"/>
+                <w:sz w:val="18"/>
+              </w:rPr>
+              <w:t>Fabricant</w:t>
+            </w:r>
+          </w:p>
+        </w:tc>
+      </w:tr>
+      <w:tr>
+        <w:tc>
+          <w:tcPr>
+            <w:tcW w:type="dxa" w:w="1304"/>
+          </w:tcPr>
+          <w:p>
+            <w:r/>
+            <w:r>
+              <w:rPr>
+                <w:sz w:val="18"/>
+              </w:rPr>
+              <w:t>IV.8.01</w:t>
+            </w:r>
+          </w:p>
+        </w:tc>
+        <w:tc>
+          <w:tcPr>
+            <w:tcW w:type="dxa" w:w="5499"/>
+          </w:tcPr>
+          <w:p>
+            <w:r/>
+            <w:r>
+              <w:rPr>
+                <w:sz w:val="18"/>
+              </w:rPr>
+              <w:t>Primaire d'accrochage — Weberprim RP</w:t>
+            </w:r>
+          </w:p>
+        </w:tc>
+        <w:tc>
+          <w:tcPr>
+            <w:tcW w:type="dxa" w:w="1984"/>
+          </w:tcPr>
+          <w:p>
+            <w:r/>
+            <w:r>
+              <w:rPr>
+                <w:sz w:val="18"/>
+              </w:rPr>
+              <w:t>WEBER</w:t>
+            </w:r>
+          </w:p>
+        </w:tc>
+      </w:tr>
+      <w:tr>
+        <w:tc>
+          <w:tcPr>
+            <w:tcW w:type="dxa" w:w="1304"/>
+          </w:tcPr>
+          <w:p>
+            <w:r/>
+            <w:r>
+              <w:rPr>
+                <w:sz w:val="18"/>
+              </w:rPr>
+              <w:t>IV.8.01</w:t>
+            </w:r>
+          </w:p>
+        </w:tc>
+        <w:tc>
+          <w:tcPr>
+            <w:tcW w:type="dxa" w:w="5499"/>
+          </w:tcPr>
+          <w:p>
+            <w:r/>
+            <w:r>
+              <w:rPr>
+                <w:sz w:val="18"/>
+              </w:rPr>
+              <w:t>Primaire de rattrapage — Cegecol PE</w:t>
+            </w:r>
+          </w:p>
+        </w:tc>
+        <w:tc>
+          <w:tcPr>
+            <w:tcW w:type="dxa" w:w="1984"/>
+          </w:tcPr>
+          <w:p>
+            <w:r/>
+            <w:r>
+              <w:rPr>
+                <w:sz w:val="18"/>
+              </w:rPr>
+              <w:t>CEGECOL</w:t>
+            </w:r>
+          </w:p>
+        </w:tc>
+      </w:tr>
+      <w:tr>
+        <w:tc>
+          <w:tcPr>
+            <w:tcW w:type="dxa" w:w="1304"/>
+          </w:tcPr>
+          <w:p>
+            <w:r/>
+            <w:r>
+              <w:rPr>
+                <w:sz w:val="18"/>
+              </w:rPr>
+              <w:t>IV.8.01</w:t>
+            </w:r>
+          </w:p>
+        </w:tc>
+        <w:tc>
+          <w:tcPr>
+            <w:tcW w:type="dxa" w:w="5499"/>
+          </w:tcPr>
+          <w:p>
+            <w:r/>
+            <w:r>
+              <w:rPr>
+                <w:sz w:val="18"/>
+              </w:rPr>
+              <w:t>Primaire d'accrochage associé — Emulcim</w:t>
+            </w:r>
+          </w:p>
+        </w:tc>
+        <w:tc>
+          <w:tcPr>
+            <w:tcW w:type="dxa" w:w="1984"/>
+          </w:tcPr>
+          <w:p>
+            <w:r/>
+            <w:r>
+              <w:rPr>
+                <w:sz w:val="18"/>
+              </w:rPr>
+              <w:t>CEGECOL</w:t>
+            </w:r>
+          </w:p>
+        </w:tc>
+      </w:tr>
+      <w:tr>
+        <w:tc>
+          <w:tcPr>
+            <w:tcW w:type="dxa" w:w="1304"/>
+          </w:tcPr>
+          <w:p>
+            <w:r/>
+            <w:r>
+              <w:rPr>
+                <w:sz w:val="18"/>
+              </w:rPr>
+              <w:t>IV.8.01</w:t>
+            </w:r>
+          </w:p>
+        </w:tc>
+        <w:tc>
+          <w:tcPr>
+            <w:tcW w:type="dxa" w:w="5499"/>
+          </w:tcPr>
+          <w:p>
+            <w:r/>
+            <w:r>
+              <w:rPr>
+                <w:sz w:val="18"/>
+              </w:rPr>
+              <w:t>Enduit de lissage P3 — Weberniv Dur+ (Nivdur S)</w:t>
+            </w:r>
+          </w:p>
+        </w:tc>
+        <w:tc>
+          <w:tcPr>
+            <w:tcW w:type="dxa" w:w="1984"/>
+          </w:tcPr>
+          <w:p>
+            <w:r/>
+            <w:r>
+              <w:rPr>
+                <w:sz w:val="18"/>
+              </w:rPr>
+              <w:t>WEBER</w:t>
+            </w:r>
+          </w:p>
+        </w:tc>
+      </w:tr>
+      <w:tr>
+        <w:tc>
+          <w:tcPr>
+            <w:tcW w:type="dxa" w:w="1304"/>
+          </w:tcPr>
+          <w:p>
+            <w:r/>
+            <w:r>
+              <w:rPr>
+                <w:sz w:val="18"/>
+              </w:rPr>
+              <w:t>IV.8.02</w:t>
+            </w:r>
+          </w:p>
+        </w:tc>
+        <w:tc>
+          <w:tcPr>
+            <w:tcW w:type="dxa" w:w="5499"/>
+          </w:tcPr>
+          <w:p>
+            <w:r/>
+            <w:r>
+              <w:rPr>
+                <w:sz w:val="18"/>
+              </w:rPr>
+              <w:t>Colle PVC — Uzin KE 2000S</w:t>
+            </w:r>
+          </w:p>
+        </w:tc>
+        <w:tc>
+          <w:tcPr>
+            <w:tcW w:type="dxa" w:w="1984"/>
+          </w:tcPr>
+          <w:p>
+            <w:r/>
+            <w:r>
+              <w:rPr>
+                <w:sz w:val="18"/>
+              </w:rPr>
+              <w:t>UZIN</w:t>
+            </w:r>
+          </w:p>
+        </w:tc>
+      </w:tr>
+      <w:tr>
+        <w:tc>
+          <w:tcPr>
+            <w:tcW w:type="dxa" w:w="1304"/>
+          </w:tcPr>
+          <w:p>
+            <w:r/>
+            <w:r>
+              <w:rPr>
+                <w:sz w:val="18"/>
+              </w:rPr>
+              <w:t>IV.8.03</w:t>
+            </w:r>
+          </w:p>
+        </w:tc>
+        <w:tc>
+          <w:tcPr>
+            <w:tcW w:type="dxa" w:w="5499"/>
+          </w:tcPr>
+          <w:p>
+            <w:r/>
+            <w:r>
+              <w:rPr>
+                <w:sz w:val="18"/>
+              </w:rPr>
+              <w:t>Revêtement de sol en lés — Taralay Impression Compact 43</w:t>
+            </w:r>
+          </w:p>
+        </w:tc>
+        <w:tc>
+          <w:tcPr>
+            <w:tcW w:type="dxa" w:w="1984"/>
+          </w:tcPr>
+          <w:p>
+            <w:r/>
+            <w:r>
+              <w:rPr>
+                <w:sz w:val="18"/>
+              </w:rPr>
+              <w:t>GERFLOR</w:t>
+            </w:r>
+          </w:p>
+        </w:tc>
+      </w:tr>
+      <w:tr>
+        <w:tc>
+          <w:tcPr>
+            <w:tcW w:type="dxa" w:w="1304"/>
+          </w:tcPr>
+          <w:p>
+            <w:r/>
+            <w:r>
+              <w:rPr>
+                <w:sz w:val="18"/>
+              </w:rPr>
+              <w:t>IV.8.04</w:t>
+            </w:r>
+          </w:p>
+        </w:tc>
+        <w:tc>
+          <w:tcPr>
+            <w:tcW w:type="dxa" w:w="5499"/>
+          </w:tcPr>
+          <w:p>
+            <w:r/>
+            <w:r>
+              <w:rPr>
+                <w:sz w:val="18"/>
+              </w:rPr>
+              <w:t>Revêtement PVC homogène — Mipolam Planet</w:t>
+            </w:r>
+          </w:p>
+        </w:tc>
+        <w:tc>
+          <w:tcPr>
+            <w:tcW w:type="dxa" w:w="1984"/>
+          </w:tcPr>
+          <w:p>
+            <w:r/>
+            <w:r>
+              <w:rPr>
+                <w:sz w:val="18"/>
+              </w:rPr>
+              <w:t>GERFLOR</w:t>
+            </w:r>
+          </w:p>
+        </w:tc>
+      </w:tr>
+      <w:tr>
+        <w:tc>
+          <w:tcPr>
+            <w:tcW w:type="dxa" w:w="1304"/>
+          </w:tcPr>
+          <w:p>
+            <w:r/>
+            <w:r>
+              <w:rPr>
+                <w:sz w:val="18"/>
+              </w:rPr>
+              <w:t>IV.8.03 / IV.8.04</w:t>
+            </w:r>
+          </w:p>
+        </w:tc>
+        <w:tc>
+          <w:tcPr>
+            <w:tcW w:type="dxa" w:w="5499"/>
+          </w:tcPr>
+          <w:p>
+            <w:r/>
+            <w:r>
+              <w:rPr>
+                <w:sz w:val="18"/>
+              </w:rPr>
+              <w:t>Profil de remontée en plinthe — réf. 0488</w:t>
+            </w:r>
+          </w:p>
+        </w:tc>
+        <w:tc>
+          <w:tcPr>
+            <w:tcW w:type="dxa" w:w="1984"/>
+          </w:tcPr>
+          <w:p>
+            <w:r/>
+            <w:r>
+              <w:rPr>
+                <w:sz w:val="18"/>
+              </w:rPr>
+              <w:t>GERFLOR</w:t>
+            </w:r>
+          </w:p>
+        </w:tc>
+      </w:tr>
+      <w:tr>
+        <w:tc>
+          <w:tcPr>
+            <w:tcW w:type="dxa" w:w="1304"/>
+          </w:tcPr>
+          <w:p>
+            <w:r/>
+            <w:r>
+              <w:rPr>
+                <w:sz w:val="18"/>
+              </w:rPr>
+              <w:t>IV.8.05</w:t>
+            </w:r>
+          </w:p>
+        </w:tc>
+        <w:tc>
+          <w:tcPr>
+            <w:tcW w:type="dxa" w:w="5499"/>
+          </w:tcPr>
+          <w:p>
+            <w:r/>
+            <w:r>
+              <w:rPr>
+                <w:sz w:val="18"/>
+              </w:rPr>
+              <w:t>Barre de seuil — laiton plat 35mm, réf. 2025090</w:t>
+            </w:r>
+          </w:p>
+        </w:tc>
+        <w:tc>
+          <w:tcPr>
+            <w:tcW w:type="dxa" w:w="1984"/>
+          </w:tcPr>
+          <w:p>
+            <w:r/>
+            <w:r>
+              <w:rPr>
+                <w:sz w:val="18"/>
+              </w:rPr>
+              <w:t>DINAC</w:t>
+            </w:r>
+          </w:p>
+        </w:tc>
+      </w:tr>
+    </w:tbl>
+    <w:p/>
+    <w:p>
+      <w:pPr>
+        <w:spacing w:before="160" w:after="60"/>
+      </w:pPr>
+      <w:r>
+        <w:rPr>
+          <w:b/>
+          <w:i/>
+          <w:color w:val="2E74B5"/>
+          <w:sz w:val="21"/>
+        </w:rPr>
+        <w:t>Peinture</w:t>
+      </w:r>
+    </w:p>
+    <w:tbl>
+      <w:tblPr>
+        <w:tblStyle w:val="TableGrid"/>
+        <w:tblW w:type="auto" w:w="0"/>
+        <w:jc w:val="center"/>
+        <w:tblLook w:firstColumn="1" w:firstRow="1" w:lastColumn="0" w:lastRow="0" w:noHBand="0" w:noVBand="1" w:val="04A0"/>
+      </w:tblPr>
+      <w:tblGrid>
+        <w:gridCol w:w="3324"/>
+        <w:gridCol w:w="3324"/>
+        <w:gridCol w:w="3324"/>
+      </w:tblGrid>
+      <w:tr>
+        <w:tc>
+          <w:tcPr>
+            <w:tcW w:type="dxa" w:w="1304"/>
+            <w:shd w:val="clear" w:color="auto" w:fill="2E74B5"/>
+          </w:tcPr>
+          <w:p>
+            <w:r/>
+            <w:r>
+              <w:rPr>
+                <w:b/>
+                <w:color w:val="FFFFFF"/>
+                <w:sz w:val="18"/>
+              </w:rPr>
+              <w:t>Art. CCTP</w:t>
+            </w:r>
+          </w:p>
+        </w:tc>
+        <w:tc>
+          <w:tcPr>
+            <w:tcW w:type="dxa" w:w="5499"/>
+            <w:shd w:val="clear" w:color="auto" w:fill="2E74B5"/>
+          </w:tcPr>
+          <w:p>
+            <w:r/>
+            <w:r>
+              <w:rPr>
+                <w:b/>
+                <w:color w:val="FFFFFF"/>
+                <w:sz w:val="18"/>
+              </w:rPr>
+              <w:t>Produit (fiche technique)</w:t>
+            </w:r>
+          </w:p>
+        </w:tc>
+        <w:tc>
+          <w:tcPr>
+            <w:tcW w:type="dxa" w:w="1984"/>
+            <w:shd w:val="clear" w:color="auto" w:fill="2E74B5"/>
+          </w:tcPr>
+          <w:p>
+            <w:r/>
+            <w:r>
+              <w:rPr>
+                <w:b/>
+                <w:color w:val="FFFFFF"/>
+                <w:sz w:val="18"/>
+              </w:rPr>
+              <w:t>Fabricant</w:t>
+            </w:r>
+          </w:p>
+        </w:tc>
+      </w:tr>
+      <w:tr>
+        <w:tc>
+          <w:tcPr>
+            <w:tcW w:type="dxa" w:w="1304"/>
+          </w:tcPr>
+          <w:p>
+            <w:r/>
+            <w:r>
+              <w:rPr>
+                <w:sz w:val="18"/>
+              </w:rPr>
+              <w:t>IV.6.02</w:t>
+            </w:r>
+          </w:p>
+        </w:tc>
+        <w:tc>
+          <w:tcPr>
+            <w:tcW w:type="dxa" w:w="5499"/>
+          </w:tcPr>
+          <w:p>
+            <w:r/>
+            <w:r>
+              <w:rPr>
+                <w:sz w:val="18"/>
+              </w:rPr>
+              <w:t>Enduit d'ébouchage/dégrossissage et ratissage — Bagar Airliss G</w:t>
+            </w:r>
+          </w:p>
+        </w:tc>
+        <w:tc>
+          <w:tcPr>
+            <w:tcW w:type="dxa" w:w="1984"/>
+          </w:tcPr>
+          <w:p>
+            <w:r/>
+            <w:r>
+              <w:rPr>
+                <w:sz w:val="18"/>
+              </w:rPr>
+              <w:t>BEISSIER</w:t>
+            </w:r>
+          </w:p>
+        </w:tc>
+      </w:tr>
+      <w:tr>
+        <w:tc>
+          <w:tcPr>
+            <w:tcW w:type="dxa" w:w="1304"/>
+          </w:tcPr>
+          <w:p>
+            <w:r/>
+            <w:r>
+              <w:rPr>
+                <w:sz w:val="18"/>
+              </w:rPr>
+              <w:t>IV.6.02</w:t>
+            </w:r>
+          </w:p>
+        </w:tc>
+        <w:tc>
+          <w:tcPr>
+            <w:tcW w:type="dxa" w:w="5499"/>
+          </w:tcPr>
+          <w:p>
+            <w:r/>
+            <w:r>
+              <w:rPr>
+                <w:sz w:val="18"/>
+              </w:rPr>
+              <w:t>Enduit de finition — Bagar Airliss F</w:t>
+            </w:r>
+          </w:p>
+        </w:tc>
+        <w:tc>
+          <w:tcPr>
+            <w:tcW w:type="dxa" w:w="1984"/>
+          </w:tcPr>
+          <w:p>
+            <w:r/>
+            <w:r>
+              <w:rPr>
+                <w:sz w:val="18"/>
+              </w:rPr>
+              <w:t>BEISSIER</w:t>
+            </w:r>
+          </w:p>
+        </w:tc>
+      </w:tr>
+      <w:tr>
+        <w:tc>
+          <w:tcPr>
+            <w:tcW w:type="dxa" w:w="1304"/>
+          </w:tcPr>
+          <w:p>
+            <w:r/>
+            <w:r>
+              <w:rPr>
+                <w:sz w:val="18"/>
+              </w:rPr>
+              <w:t>IV.6.01 / IV.6.02</w:t>
+            </w:r>
+          </w:p>
+        </w:tc>
+        <w:tc>
+          <w:tcPr>
+            <w:tcW w:type="dxa" w:w="5499"/>
+          </w:tcPr>
+          <w:p>
+            <w:r/>
+            <w:r>
+              <w:rPr>
+                <w:sz w:val="18"/>
+              </w:rPr>
+              <w:t>Impression sur plafonds et parements cartonnés — Muroprim</w:t>
+            </w:r>
+          </w:p>
+        </w:tc>
+        <w:tc>
+          <w:tcPr>
+            <w:tcW w:type="dxa" w:w="1984"/>
+          </w:tcPr>
+          <w:p>
+            <w:r/>
+            <w:r>
+              <w:rPr>
+                <w:sz w:val="18"/>
+              </w:rPr>
+              <w:t>SEIGNEURIE</w:t>
+            </w:r>
+          </w:p>
+        </w:tc>
+      </w:tr>
+      <w:tr>
+        <w:tc>
+          <w:tcPr>
+            <w:tcW w:type="dxa" w:w="1304"/>
+          </w:tcPr>
+          <w:p>
+            <w:r/>
+            <w:r>
+              <w:rPr>
+                <w:sz w:val="18"/>
+              </w:rPr>
+              <w:t>IV.6.02</w:t>
+            </w:r>
+          </w:p>
+        </w:tc>
+        <w:tc>
+          <w:tcPr>
+            <w:tcW w:type="dxa" w:w="5499"/>
+          </w:tcPr>
+          <w:p>
+            <w:r/>
+            <w:r>
+              <w:rPr>
+                <w:sz w:val="18"/>
+              </w:rPr>
+              <w:t>Impression pigmentée aqueuse (murs) — Indeko Bio Fix, faible C.O.V.</w:t>
+            </w:r>
+          </w:p>
+        </w:tc>
+        <w:tc>
+          <w:tcPr>
+            <w:tcW w:type="dxa" w:w="1984"/>
+          </w:tcPr>
+          <w:p>
+            <w:r/>
+            <w:r>
+              <w:rPr>
+                <w:sz w:val="18"/>
+              </w:rPr>
+              <w:t>CAPAROL</w:t>
+            </w:r>
+          </w:p>
+        </w:tc>
+      </w:tr>
+      <w:tr>
+        <w:tc>
+          <w:tcPr>
+            <w:tcW w:type="dxa" w:w="1304"/>
+          </w:tcPr>
+          <w:p>
+            <w:r/>
+            <w:r>
+              <w:rPr>
+                <w:sz w:val="18"/>
+              </w:rPr>
+              <w:t>IV.6.03</w:t>
+            </w:r>
+          </w:p>
+        </w:tc>
+        <w:tc>
+          <w:tcPr>
+            <w:tcW w:type="dxa" w:w="5499"/>
+          </w:tcPr>
+          <w:p>
+            <w:r/>
+            <w:r>
+              <w:rPr>
+                <w:sz w:val="18"/>
+              </w:rPr>
+              <w:t>Rebouchage bois — Sintobois Standard</w:t>
+            </w:r>
+          </w:p>
+        </w:tc>
+        <w:tc>
+          <w:tcPr>
+            <w:tcW w:type="dxa" w:w="1984"/>
+          </w:tcPr>
+          <w:p>
+            <w:r/>
+            <w:r>
+              <w:rPr>
+                <w:sz w:val="18"/>
+              </w:rPr>
+              <w:t>SINTO</w:t>
+            </w:r>
+          </w:p>
+        </w:tc>
+      </w:tr>
+      <w:tr>
+        <w:tc>
+          <w:tcPr>
+            <w:tcW w:type="dxa" w:w="1304"/>
+          </w:tcPr>
+          <w:p>
+            <w:r/>
+            <w:r>
+              <w:rPr>
+                <w:sz w:val="18"/>
+              </w:rPr>
+              <w:t>IV.6.03</w:t>
+            </w:r>
+          </w:p>
+        </w:tc>
+        <w:tc>
+          <w:tcPr>
+            <w:tcW w:type="dxa" w:w="5499"/>
+          </w:tcPr>
+          <w:p>
+            <w:r/>
+            <w:r>
+              <w:rPr>
+                <w:sz w:val="18"/>
+              </w:rPr>
+              <w:t>Impression du bois — Primwood Aqua Robust</w:t>
+            </w:r>
+          </w:p>
+        </w:tc>
+        <w:tc>
+          <w:tcPr>
+            <w:tcW w:type="dxa" w:w="1984"/>
+          </w:tcPr>
+          <w:p>
+            <w:r/>
+            <w:r>
+              <w:rPr>
+                <w:sz w:val="18"/>
+              </w:rPr>
+              <w:t>SEIGNEURIE</w:t>
+            </w:r>
+          </w:p>
+        </w:tc>
+      </w:tr>
+      <w:tr>
+        <w:tc>
+          <w:tcPr>
+            <w:tcW w:type="dxa" w:w="1304"/>
+          </w:tcPr>
+          <w:p>
+            <w:r/>
+            <w:r>
+              <w:rPr>
+                <w:sz w:val="18"/>
+              </w:rPr>
+              <w:t>IV.6.04</w:t>
+            </w:r>
+          </w:p>
+        </w:tc>
+        <w:tc>
+          <w:tcPr>
+            <w:tcW w:type="dxa" w:w="5499"/>
+          </w:tcPr>
+          <w:p>
+            <w:r/>
+            <w:r>
+              <w:rPr>
+                <w:sz w:val="18"/>
+              </w:rPr>
+              <w:t>Primaire antirouille métaux ferreux — Freitamétal Expert</w:t>
+            </w:r>
+          </w:p>
+        </w:tc>
+        <w:tc>
+          <w:tcPr>
+            <w:tcW w:type="dxa" w:w="1984"/>
+          </w:tcPr>
+          <w:p>
+            <w:r/>
+            <w:r>
+              <w:rPr>
+                <w:sz w:val="18"/>
+              </w:rPr>
+              <w:t>SEIGNEURIE</w:t>
+            </w:r>
+          </w:p>
+        </w:tc>
+      </w:tr>
+      <w:tr>
+        <w:tc>
+          <w:tcPr>
+            <w:tcW w:type="dxa" w:w="1304"/>
+          </w:tcPr>
+          <w:p>
+            <w:r/>
+            <w:r>
+              <w:rPr>
+                <w:sz w:val="18"/>
+              </w:rPr>
+              <w:t>IV.6.04 / IV.6.05</w:t>
+            </w:r>
+          </w:p>
+        </w:tc>
+        <w:tc>
+          <w:tcPr>
+            <w:tcW w:type="dxa" w:w="5499"/>
+          </w:tcPr>
+          <w:p>
+            <w:r/>
+            <w:r>
+              <w:rPr>
+                <w:sz w:val="18"/>
+              </w:rPr>
+              <w:t>Primaire d'accrochage métaux non ferreux et PVC — Print ADR</w:t>
+            </w:r>
+          </w:p>
+        </w:tc>
+        <w:tc>
+          <w:tcPr>
+            <w:tcW w:type="dxa" w:w="1984"/>
+          </w:tcPr>
+          <w:p>
+            <w:r/>
+            <w:r>
+              <w:rPr>
+                <w:sz w:val="18"/>
+              </w:rPr>
+              <w:t>SEIGNEURIE</w:t>
+            </w:r>
+          </w:p>
+        </w:tc>
+      </w:tr>
+      <w:tr>
+        <w:tc>
+          <w:tcPr>
+            <w:tcW w:type="dxa" w:w="1304"/>
+          </w:tcPr>
+          <w:p>
+            <w:r/>
+            <w:r>
+              <w:rPr>
+                <w:sz w:val="18"/>
+              </w:rPr>
+              <w:t>IV.6.01 / IV.6.03 / IV.6.04 / IV.6.05</w:t>
+            </w:r>
+          </w:p>
+        </w:tc>
+        <w:tc>
+          <w:tcPr>
+            <w:tcW w:type="dxa" w:w="5499"/>
+          </w:tcPr>
+          <w:p>
+            <w:r/>
+            <w:r>
+              <w:rPr>
+                <w:sz w:val="18"/>
+              </w:rPr>
+              <w:t>Peinture de finition plafonds/bois/métaux/PVC — Garnysatin S2P</w:t>
+            </w:r>
+          </w:p>
+        </w:tc>
+        <w:tc>
+          <w:tcPr>
+            <w:tcW w:type="dxa" w:w="1984"/>
+          </w:tcPr>
+          <w:p>
+            <w:r/>
+            <w:r>
+              <w:rPr>
+                <w:sz w:val="18"/>
+              </w:rPr>
+              <w:t>SEIGNEURIE</w:t>
+            </w:r>
+          </w:p>
+        </w:tc>
+      </w:tr>
+      <w:tr>
+        <w:tc>
+          <w:tcPr>
+            <w:tcW w:type="dxa" w:w="1304"/>
+          </w:tcPr>
+          <w:p>
+            <w:r/>
+            <w:r>
+              <w:rPr>
+                <w:sz w:val="18"/>
+              </w:rPr>
+              <w:t>IV.6.02</w:t>
+            </w:r>
+          </w:p>
+        </w:tc>
+        <w:tc>
+          <w:tcPr>
+            <w:tcW w:type="dxa" w:w="5499"/>
+          </w:tcPr>
+          <w:p>
+            <w:r/>
+            <w:r>
+              <w:rPr>
+                <w:sz w:val="18"/>
+              </w:rPr>
+              <w:t>Peinture de finition murs — Indeko Satin, faible C.O.V.</w:t>
+            </w:r>
+          </w:p>
+        </w:tc>
+        <w:tc>
+          <w:tcPr>
+            <w:tcW w:type="dxa" w:w="1984"/>
+          </w:tcPr>
+          <w:p>
+            <w:r/>
+            <w:r>
+              <w:rPr>
+                <w:sz w:val="18"/>
+              </w:rPr>
+              <w:t>CAPAROL</w:t>
+            </w:r>
+          </w:p>
+        </w:tc>
+      </w:tr>
+    </w:tbl>
+    <w:p/>
+    <w:p>
+      <w:r>
+        <w:rPr>
+          <w:b w:val="0"/>
+          <w:i/>
+          <w:sz w:val="21"/>
+        </w:rPr>
+        <w:t>L'ensemble de ces fiches techniques, référencées dans le dossier joint en annexe, dispose de la marque NF/CE et des étiquetages sanitaires A+/Ecolabel applicables (cf. § 2.6 pour l'enjeu émissions C.O.V.).</w:t>
+      </w:r>
+    </w:p>
     <w:p>
       <w:r>
         <w:br w:type="page"/>
@@ -2145,7 +2763,7 @@
         <w:pStyle w:val="ListBullet"/>
       </w:pPr>
       <w:r>
-        <w:t>Usage exclusif de peintures à très faible émission de C.O.V. certifiées Ecolabel (Caparol Indeko), limitant les nuisances olfactives pour les zones occupées voisines.</w:t>
+        <w:t>Usage exclusif de produits d'impression et de peinture à très faible émission de C.O.V. (Indeko Bio Fix / Indeko Satin — Caparol pour les murs, Muroprim / Garnysatin S2P — Seigneurie pour plafonds, bois, métaux et PVC), limitant les nuisances olfactives pour les zones occupées voisines.</w:t>
       </w:r>
     </w:p>
     <w:p>
@@ -2930,7 +3548,7 @@
           <w:i w:val="0"/>
           <w:sz w:val="21"/>
         </w:rPr>
-        <w:t>Les travaux de peinture sont exécutés conformément aux DTU 59.1 et 59.4 et aux spécifications techniques U.N.P., avec un système Caparol Indeko à très faible émission de C.O.V. certifié Ecolabel (Art. III.3.02 et IV.6 du CCTP).</w:t>
+        <w:t>Les travaux de peinture sont exécutés conformément aux DTU 59.1 et 59.4 et aux spécifications techniques U.N.P., avec des systèmes à très faible émission de C.O.V. certifiés Ecolabel : Indeko Bio Fix / Indeko Satin (Caparol) pour les murs, Muroprim / Garnysatin S2P (Seigneurie) pour plafonds, boiseries, métaux et PVC (Art. III.3.02 et IV.6 du CCTP).</w:t>
       </w:r>
     </w:p>
     <w:p>
@@ -2985,7 +3603,7 @@
       <w:tr>
         <w:tc>
           <w:tcPr>
-            <w:tcW w:type="dxa" w:w="2835"/>
+            <w:tcW w:type="dxa" w:w="3118"/>
             <w:shd w:val="clear" w:color="auto" w:fill="2E74B5"/>
           </w:tcPr>
           <w:p>
@@ -3002,7 +3620,7 @@
         </w:tc>
         <w:tc>
           <w:tcPr>
-            <w:tcW w:type="dxa" w:w="5669"/>
+            <w:tcW w:type="dxa" w:w="5386"/>
             <w:shd w:val="clear" w:color="auto" w:fill="2E74B5"/>
           </w:tcPr>
           <w:p>
@@ -3013,7 +3631,7 @@
                 <w:color w:val="FFFFFF"/>
                 <w:sz w:val="18"/>
               </w:rPr>
-              <w:t>Description</w:t>
+              <w:t>Description / produit mis en œuvre</w:t>
             </w:r>
           </w:p>
         </w:tc>
@@ -3021,7 +3639,7 @@
       <w:tr>
         <w:tc>
           <w:tcPr>
-            <w:tcW w:type="dxa" w:w="2835"/>
+            <w:tcW w:type="dxa" w:w="3118"/>
           </w:tcPr>
           <w:p>
             <w:r/>
@@ -3035,7 +3653,7 @@
         </w:tc>
         <w:tc>
           <w:tcPr>
-            <w:tcW w:type="dxa" w:w="5669"/>
+            <w:tcW w:type="dxa" w:w="5386"/>
           </w:tcPr>
           <w:p>
             <w:r/>
@@ -3051,29 +3669,29 @@
       <w:tr>
         <w:tc>
           <w:tcPr>
-            <w:tcW w:type="dxa" w:w="2835"/>
-          </w:tcPr>
-          <w:p>
-            <w:r/>
-            <w:r>
-              <w:rPr>
-                <w:sz w:val="18"/>
-              </w:rPr>
-              <w:t>Impression</w:t>
-            </w:r>
-          </w:p>
-        </w:tc>
-        <w:tc>
-          <w:tcPr>
-            <w:tcW w:type="dxa" w:w="5669"/>
-          </w:tcPr>
-          <w:p>
-            <w:r/>
-            <w:r>
-              <w:rPr>
-                <w:sz w:val="18"/>
-              </w:rPr>
-              <w:t>Couche d'accroche pigmentée</w:t>
+            <w:tcW w:type="dxa" w:w="3118"/>
+          </w:tcPr>
+          <w:p>
+            <w:r/>
+            <w:r>
+              <w:rPr>
+                <w:sz w:val="18"/>
+              </w:rPr>
+              <w:t>Enduit d'ébouchage / dégrossissage et ratissage</w:t>
+            </w:r>
+          </w:p>
+        </w:tc>
+        <w:tc>
+          <w:tcPr>
+            <w:tcW w:type="dxa" w:w="5386"/>
+          </w:tcPr>
+          <w:p>
+            <w:r/>
+            <w:r>
+              <w:rPr>
+                <w:sz w:val="18"/>
+              </w:rPr>
+              <w:t>Bagar Airliss G — Beissier</w:t>
             </w:r>
           </w:p>
         </w:tc>
@@ -3081,29 +3699,29 @@
       <w:tr>
         <w:tc>
           <w:tcPr>
-            <w:tcW w:type="dxa" w:w="2835"/>
-          </w:tcPr>
-          <w:p>
-            <w:r/>
-            <w:r>
-              <w:rPr>
-                <w:sz w:val="18"/>
-              </w:rPr>
-              <w:t>Rebouchage</w:t>
-            </w:r>
-          </w:p>
-        </w:tc>
-        <w:tc>
-          <w:tcPr>
-            <w:tcW w:type="dxa" w:w="5669"/>
-          </w:tcPr>
-          <w:p>
-            <w:r/>
-            <w:r>
-              <w:rPr>
-                <w:sz w:val="18"/>
-              </w:rPr>
-              <w:t>Traitement des défauts localisés</w:t>
+            <w:tcW w:type="dxa" w:w="3118"/>
+          </w:tcPr>
+          <w:p>
+            <w:r/>
+            <w:r>
+              <w:rPr>
+                <w:sz w:val="18"/>
+              </w:rPr>
+              <w:t>Impression</w:t>
+            </w:r>
+          </w:p>
+        </w:tc>
+        <w:tc>
+          <w:tcPr>
+            <w:tcW w:type="dxa" w:w="5386"/>
+          </w:tcPr>
+          <w:p>
+            <w:r/>
+            <w:r>
+              <w:rPr>
+                <w:sz w:val="18"/>
+              </w:rPr>
+              <w:t>Muroprim (impression plafonds et parements cartonnés) — Seigneurie</w:t>
             </w:r>
           </w:p>
         </w:tc>
@@ -3111,29 +3729,29 @@
       <w:tr>
         <w:tc>
           <w:tcPr>
-            <w:tcW w:type="dxa" w:w="2835"/>
-          </w:tcPr>
-          <w:p>
-            <w:r/>
-            <w:r>
-              <w:rPr>
-                <w:sz w:val="18"/>
-              </w:rPr>
-              <w:t>Enduit repassé + ponçage + époussetage</w:t>
-            </w:r>
-          </w:p>
-        </w:tc>
-        <w:tc>
-          <w:tcPr>
-            <w:tcW w:type="dxa" w:w="5669"/>
-          </w:tcPr>
-          <w:p>
-            <w:r/>
-            <w:r>
-              <w:rPr>
-                <w:sz w:val="18"/>
-              </w:rPr>
-              <w:t>Mise à niveau et préparation finale de surface</w:t>
+            <w:tcW w:type="dxa" w:w="3118"/>
+          </w:tcPr>
+          <w:p>
+            <w:r/>
+            <w:r>
+              <w:rPr>
+                <w:sz w:val="18"/>
+              </w:rPr>
+              <w:t>Rebouchage / enduit repassé</w:t>
+            </w:r>
+          </w:p>
+        </w:tc>
+        <w:tc>
+          <w:tcPr>
+            <w:tcW w:type="dxa" w:w="5386"/>
+          </w:tcPr>
+          <w:p>
+            <w:r/>
+            <w:r>
+              <w:rPr>
+                <w:sz w:val="18"/>
+              </w:rPr>
+              <w:t>Bagar Airliss F (enduit de finition) — Beissier, puis ponçage et époussetage</w:t>
             </w:r>
           </w:p>
         </w:tc>
@@ -3141,7 +3759,7 @@
       <w:tr>
         <w:tc>
           <w:tcPr>
-            <w:tcW w:type="dxa" w:w="2835"/>
+            <w:tcW w:type="dxa" w:w="3118"/>
           </w:tcPr>
           <w:p>
             <w:r/>
@@ -3155,15 +3773,15 @@
         </w:tc>
         <w:tc>
           <w:tcPr>
-            <w:tcW w:type="dxa" w:w="5669"/>
-          </w:tcPr>
-          <w:p>
-            <w:r/>
-            <w:r>
-              <w:rPr>
-                <w:sz w:val="18"/>
-              </w:rPr>
-              <w:t>2 couches de peinture satinée glycérophtalique — Finition A, teinte au choix du MOE</w:t>
+            <w:tcW w:type="dxa" w:w="5386"/>
+          </w:tcPr>
+          <w:p>
+            <w:r/>
+            <w:r>
+              <w:rPr>
+                <w:sz w:val="18"/>
+              </w:rPr>
+              <w:t>2 couches Garnysatin S2P — Seigneurie — Finition A, teinte au choix du MOE</w:t>
             </w:r>
           </w:p>
         </w:tc>
@@ -3208,7 +3826,7 @@
       <w:tr>
         <w:tc>
           <w:tcPr>
-            <w:tcW w:type="dxa" w:w="2835"/>
+            <w:tcW w:type="dxa" w:w="3118"/>
             <w:shd w:val="clear" w:color="auto" w:fill="2E74B5"/>
           </w:tcPr>
           <w:p>
@@ -3225,7 +3843,7 @@
         </w:tc>
         <w:tc>
           <w:tcPr>
-            <w:tcW w:type="dxa" w:w="5669"/>
+            <w:tcW w:type="dxa" w:w="5386"/>
             <w:shd w:val="clear" w:color="auto" w:fill="2E74B5"/>
           </w:tcPr>
           <w:p>
@@ -3236,7 +3854,7 @@
                 <w:color w:val="FFFFFF"/>
                 <w:sz w:val="18"/>
               </w:rPr>
-              <w:t>Séquence d'exécution</w:t>
+              <w:t>Séquence d'exécution / produits mis en œuvre</w:t>
             </w:r>
           </w:p>
         </w:tc>
@@ -3244,7 +3862,7 @@
       <w:tr>
         <w:tc>
           <w:tcPr>
-            <w:tcW w:type="dxa" w:w="2835"/>
+            <w:tcW w:type="dxa" w:w="3118"/>
           </w:tcPr>
           <w:p>
             <w:r/>
@@ -3258,15 +3876,15 @@
         </w:tc>
         <w:tc>
           <w:tcPr>
-            <w:tcW w:type="dxa" w:w="5669"/>
-          </w:tcPr>
-          <w:p>
-            <w:r/>
-            <w:r>
-              <w:rPr>
-                <w:sz w:val="18"/>
-              </w:rPr>
-              <w:t>Lessivage/arrachage des revêtements existants (évacuation gravats) → égrenage → rebouchage/ponçage/enduit repassé → impression Indeko Fix → finition 2 couches Indeko Satin (Finition A)</w:t>
+            <w:tcW w:type="dxa" w:w="5386"/>
+          </w:tcPr>
+          <w:p>
+            <w:r/>
+            <w:r>
+              <w:rPr>
+                <w:sz w:val="18"/>
+              </w:rPr>
+              <w:t>Lessivage/arrachage des revêtements existants (évacuation gravats) → égrenage → rebouchage/ponçage (Bagar Airliss G/F — Beissier) → impression Indeko Bio Fix (Caparol) → finition 2 couches Indeko Satin (Caparol) — Finition A</w:t>
             </w:r>
           </w:p>
         </w:tc>
@@ -3274,7 +3892,7 @@
       <w:tr>
         <w:tc>
           <w:tcPr>
-            <w:tcW w:type="dxa" w:w="2835"/>
+            <w:tcW w:type="dxa" w:w="3118"/>
           </w:tcPr>
           <w:p>
             <w:r/>
@@ -3288,15 +3906,15 @@
         </w:tc>
         <w:tc>
           <w:tcPr>
-            <w:tcW w:type="dxa" w:w="5669"/>
-          </w:tcPr>
-          <w:p>
-            <w:r/>
-            <w:r>
-              <w:rPr>
-                <w:sz w:val="18"/>
-              </w:rPr>
-              <w:t>Époussetage → impression Indeko Fix → rebouchage → enduit repassé/ponçage/époussetage → finition 2 couches Indeko Satin (Finition A)</w:t>
+            <w:tcW w:type="dxa" w:w="5386"/>
+          </w:tcPr>
+          <w:p>
+            <w:r/>
+            <w:r>
+              <w:rPr>
+                <w:sz w:val="18"/>
+              </w:rPr>
+              <w:t>Époussetage → impression Indeko Bio Fix (Caparol) → rebouchage/enduit repassé (Bagar Airliss — Beissier) → finition 2 couches Indeko Satin (Caparol) — Finition A</w:t>
             </w:r>
           </w:p>
         </w:tc>
@@ -3341,7 +3959,7 @@
       <w:tr>
         <w:tc>
           <w:tcPr>
-            <w:tcW w:type="dxa" w:w="2835"/>
+            <w:tcW w:type="dxa" w:w="3118"/>
             <w:shd w:val="clear" w:color="auto" w:fill="2E74B5"/>
           </w:tcPr>
           <w:p>
@@ -3358,7 +3976,7 @@
         </w:tc>
         <w:tc>
           <w:tcPr>
-            <w:tcW w:type="dxa" w:w="5669"/>
+            <w:tcW w:type="dxa" w:w="5386"/>
             <w:shd w:val="clear" w:color="auto" w:fill="2E74B5"/>
           </w:tcPr>
           <w:p>
@@ -3369,7 +3987,7 @@
                 <w:color w:val="FFFFFF"/>
                 <w:sz w:val="18"/>
               </w:rPr>
-              <w:t>Séquence d'exécution</w:t>
+              <w:t>Séquence d'exécution / produits mis en œuvre</w:t>
             </w:r>
           </w:p>
         </w:tc>
@@ -3377,7 +3995,7 @@
       <w:tr>
         <w:tc>
           <w:tcPr>
-            <w:tcW w:type="dxa" w:w="2835"/>
+            <w:tcW w:type="dxa" w:w="3118"/>
           </w:tcPr>
           <w:p>
             <w:r/>
@@ -3391,15 +4009,15 @@
         </w:tc>
         <w:tc>
           <w:tcPr>
-            <w:tcW w:type="dxa" w:w="5669"/>
-          </w:tcPr>
-          <w:p>
-            <w:r/>
-            <w:r>
-              <w:rPr>
-                <w:sz w:val="18"/>
-              </w:rPr>
-              <w:t>Brossage → impression → rebouchage/ponçage → enduit repassé → ponçage à sec → finition 2 couches satinée glycérophtalique (Finition A)</w:t>
+            <w:tcW w:type="dxa" w:w="5386"/>
+          </w:tcPr>
+          <w:p>
+            <w:r/>
+            <w:r>
+              <w:rPr>
+                <w:sz w:val="18"/>
+              </w:rPr>
+              <w:t>Brossage → rebouchage bois Sintobois Standard (Sinto) → impression Primwood Aqua Robust (Seigneurie) → ponçage à sec → finition 2 couches Garnysatin S2P (Seigneurie) — Finition A</w:t>
             </w:r>
           </w:p>
         </w:tc>
@@ -3407,7 +4025,7 @@
       <w:tr>
         <w:tc>
           <w:tcPr>
-            <w:tcW w:type="dxa" w:w="2835"/>
+            <w:tcW w:type="dxa" w:w="3118"/>
           </w:tcPr>
           <w:p>
             <w:r/>
@@ -3421,15 +4039,15 @@
         </w:tc>
         <w:tc>
           <w:tcPr>
-            <w:tcW w:type="dxa" w:w="5669"/>
-          </w:tcPr>
-          <w:p>
-            <w:r/>
-            <w:r>
-              <w:rPr>
-                <w:sz w:val="18"/>
-              </w:rPr>
-              <w:t>Brossage → enduit non repassé (rives des portes) → impression → finition 2 couches laque satinée (Finition A)</w:t>
+            <w:tcW w:type="dxa" w:w="5386"/>
+          </w:tcPr>
+          <w:p>
+            <w:r/>
+            <w:r>
+              <w:rPr>
+                <w:sz w:val="18"/>
+              </w:rPr>
+              <w:t>Brossage → enduit non repassé (rives des portes) → impression Primwood Aqua Robust (Seigneurie) → finition 2 couches Garnysatin S2P — Finition A</w:t>
             </w:r>
           </w:p>
         </w:tc>
@@ -3437,7 +4055,7 @@
       <w:tr>
         <w:tc>
           <w:tcPr>
-            <w:tcW w:type="dxa" w:w="2835"/>
+            <w:tcW w:type="dxa" w:w="3118"/>
           </w:tcPr>
           <w:p>
             <w:r/>
@@ -3451,15 +4069,15 @@
         </w:tc>
         <w:tc>
           <w:tcPr>
-            <w:tcW w:type="dxa" w:w="5669"/>
-          </w:tcPr>
-          <w:p>
-            <w:r/>
-            <w:r>
-              <w:rPr>
-                <w:sz w:val="18"/>
-              </w:rPr>
-              <w:t>Lessivage → égrenage → rebouchage/ponçage → impression → enduit repassé/ponçage → finition 2 couches (Finition A)</w:t>
+            <w:tcW w:type="dxa" w:w="5386"/>
+          </w:tcPr>
+          <w:p>
+            <w:r/>
+            <w:r>
+              <w:rPr>
+                <w:sz w:val="18"/>
+              </w:rPr>
+              <w:t>Lessivage → égrenage → rebouchage/ponçage → impression Primwood Aqua Robust → enduit repassé/ponçage → finition 2 couches Garnysatin S2P — Finition A</w:t>
             </w:r>
           </w:p>
         </w:tc>
@@ -3467,7 +4085,7 @@
       <w:tr>
         <w:tc>
           <w:tcPr>
-            <w:tcW w:type="dxa" w:w="2835"/>
+            <w:tcW w:type="dxa" w:w="3118"/>
           </w:tcPr>
           <w:p>
             <w:r/>
@@ -3481,15 +4099,15 @@
         </w:tc>
         <w:tc>
           <w:tcPr>
-            <w:tcW w:type="dxa" w:w="5669"/>
-          </w:tcPr>
-          <w:p>
-            <w:r/>
-            <w:r>
-              <w:rPr>
-                <w:sz w:val="18"/>
-              </w:rPr>
-              <w:t>Brossage → dégraissage → 1 couche antirouille → finition 2 couches (Finition B)</w:t>
+            <w:tcW w:type="dxa" w:w="5386"/>
+          </w:tcPr>
+          <w:p>
+            <w:r/>
+            <w:r>
+              <w:rPr>
+                <w:sz w:val="18"/>
+              </w:rPr>
+              <w:t>Brossage → dégraissage → 1 couche antirouille Freitamétal Expert (Seigneurie) → finition 2 couches Garnysatin S2P — Finition B</w:t>
             </w:r>
           </w:p>
         </w:tc>
@@ -3497,7 +4115,7 @@
       <w:tr>
         <w:tc>
           <w:tcPr>
-            <w:tcW w:type="dxa" w:w="2835"/>
+            <w:tcW w:type="dxa" w:w="3118"/>
           </w:tcPr>
           <w:p>
             <w:r/>
@@ -3511,15 +4129,15 @@
         </w:tc>
         <w:tc>
           <w:tcPr>
-            <w:tcW w:type="dxa" w:w="5669"/>
-          </w:tcPr>
-          <w:p>
-            <w:r/>
-            <w:r>
-              <w:rPr>
-                <w:sz w:val="18"/>
-              </w:rPr>
-              <w:t>Dégraissage → 1 couche primaire d'accrochage → finition 2 couches (Finition B)</w:t>
+            <w:tcW w:type="dxa" w:w="5386"/>
+          </w:tcPr>
+          <w:p>
+            <w:r/>
+            <w:r>
+              <w:rPr>
+                <w:sz w:val="18"/>
+              </w:rPr>
+              <w:t>Dégraissage → 1 couche primaire d'accrochage Print ADR (Seigneurie) → finition 2 couches Garnysatin S2P — Finition B</w:t>
             </w:r>
           </w:p>
         </w:tc>
@@ -3527,7 +4145,7 @@
       <w:tr>
         <w:tc>
           <w:tcPr>
-            <w:tcW w:type="dxa" w:w="2835"/>
+            <w:tcW w:type="dxa" w:w="3118"/>
           </w:tcPr>
           <w:p>
             <w:r/>
@@ -3541,15 +4159,15 @@
         </w:tc>
         <w:tc>
           <w:tcPr>
-            <w:tcW w:type="dxa" w:w="5669"/>
-          </w:tcPr>
-          <w:p>
-            <w:r/>
-            <w:r>
-              <w:rPr>
-                <w:sz w:val="18"/>
-              </w:rPr>
-              <w:t>Dégraissage → ponçage d'adhérence → primaire d'accrochage → 1 couche satinée (Finition B)</w:t>
+            <w:tcW w:type="dxa" w:w="5386"/>
+          </w:tcPr>
+          <w:p>
+            <w:r/>
+            <w:r>
+              <w:rPr>
+                <w:sz w:val="18"/>
+              </w:rPr>
+              <w:t>Dégraissage → ponçage d'adhérence → primaire d'accrochage Print ADR (Seigneurie) → 1 couche Garnysatin S2P — Finition B</w:t>
             </w:r>
           </w:p>
         </w:tc>
@@ -3629,7 +4247,7 @@
           <w:i w:val="0"/>
           <w:sz w:val="21"/>
         </w:rPr>
-        <w:t>Un enduit de lissage type Nivdur S (Weber &amp; Broutin) ou équivalent, classement P.3, épaisseur minimale 3mm, est appliqué après nettoyage complémentaire de la chape (Art. IV.8.01). Le rattrapage des différences de niveau importantes est réalisé au CEGECOL PE avec primaire d'accrochage. L'enduit fait l'objet d'un avis technique CSTB soumis à validation du MOE et du Bureau de Contrôle.</w:t>
+        <w:t>Après nettoyage complémentaire de la chape, un primaire d'accrochage Weberprim RP (Weber) est appliqué, suivi d'un enduit de lissage Weberniv Dur+ (Nivdur S, Weber), classement P.3, épaisseur minimale 3mm (Art. IV.8.01). Le rattrapage des différences de niveau importantes est réalisé au Cegecol PE avec primaire d'accrochage associé Emulcim (Cegecol). L'enduit fait l'objet d'un avis technique CSTB soumis à validation du MOE et du Bureau de Contrôle.</w:t>
       </w:r>
     </w:p>
     <w:p>
@@ -3653,7 +4271,7 @@
           <w:i w:val="0"/>
           <w:sz w:val="21"/>
         </w:rPr>
-        <w:t>Les colles utilisées sont de première qualité, compatibles avec le revêtement posé et le support, conformément aux recommandations du fabricant (Art. IV.8.02). La pose est réalisée lé par lé, lés/dalles parfaitement jointifs et de niveau, calepinage conforme au plan validé par le MOE ; l'emploi de chutes est proscrit.</w:t>
+        <w:t>L'encollage est réalisé avec la colle PVC Uzin KE 2000S (Uzin), compatible avec les revêtements Taralay Impression Compact 43 et Mipolam Planet ainsi qu'avec le support ragréé, conformément aux recommandations du fabricant (Art. IV.8.02). La pose est réalisée lé par lé, lés/dalles parfaitement jointifs et de niveau, calepinage conforme au plan validé par le MOE ; l'emploi de chutes est proscrit.</w:t>
       </w:r>
     </w:p>
     <w:p>

</xml_diff>

<commit_message>
Recale le chapitre 2 (§2.3 à 2.13) sur le planning d'exécution (chapitre 3)
Ajoute des références croisées explicites aux semaines et effectifs
du planning prévisionnel dans les sections préparation de chantier,
approvisionnements, protection des ouvrages, propreté, coordination
inter-lots, méthodologies faux plafonds/peinture/sols, et clôture
du lot (nettoyage/OPR/réserves), pour assurer la cohérence interne
du mémoire technique entre organisation, méthodologie et planning.

Co-Authored-By: Claude Sonnet 5 <noreply@anthropic.com>
Claude-Session: https://claude.ai/code/session_016J8ZBxzUkBqS3C16QP9P63
</commit_message>
<xml_diff>
--- a/livrables/Lot3_Chapitre2_Organisation_Methodologie.docx
+++ b/livrables/Lot3_Chapitre2_Organisation_Methodologie.docx
@@ -2090,7 +2090,7 @@
           <w:i w:val="0"/>
           <w:sz w:val="21"/>
         </w:rPr>
-        <w:t>Conformément à l'article XI du CCAP, la période de préparation d'un mois est mise à profit pour sécuriser l'ensemble des conditions de démarrage de notre intervention.</w:t>
+        <w:t>Conformément à l'article XI du CCAP, la période de préparation d'un mois est mise à profit pour sécuriser l'ensemble des conditions de démarrage de notre intervention. Dans notre planning prévisionnel (chapitre 3), cette période correspond à la semaine Mois 1 - S4, mobilisant 2 personnes de notre équipe d'études.</w:t>
       </w:r>
     </w:p>
     <w:tbl>
@@ -2496,7 +2496,7 @@
         <w:pStyle w:val="ListBullet"/>
       </w:pPr>
       <w:r>
-        <w:t>Approvisionnements séquencés par local, au plus près du besoin, afin de limiter le stockage sur site (produits inflammables/COV en particulier).</w:t>
+        <w:t>Approvisionnements séquencés semaine par semaine selon notre planning (chapitre 3) : dalles et ossatures de faux plafonds livrées avant la semaine Mois 4 - S1, produits de peinture avant la semaine Mois 4 - S2, revêtements de sols et colles avant la semaine Mois 4 - S3 — limitant d'autant le stockage prolongé sur site (produits inflammables/COV en particulier).</w:t>
       </w:r>
     </w:p>
     <w:p>
@@ -2526,6 +2526,16 @@
           <w:sz w:val="24"/>
         </w:rPr>
         <w:t>2.5. Protection des locaux, des circulations et des ouvrages existants</w:t>
+      </w:r>
+    </w:p>
+    <w:p>
+      <w:r>
+        <w:rPr>
+          <w:b w:val="0"/>
+          <w:i w:val="0"/>
+          <w:sz w:val="21"/>
+        </w:rPr>
+        <w:t>Notre planning (chapitre 3) séquence volontairement les corps de métier du lot dans l'ordre faux plafonds (Mois 4 - S1) → peinture (Mois 4 - S2) → sols souples (Mois 4 - S3), les sols étant posés en dernier afin d'éviter toute salissure ou dégradation par la poursuite des autres opérations du lot. Les protections ci-dessous sont maintenues jusqu'à la marge de sécurité précédant la clôture du lot (Mois 4 - S4 à Mois 5 - S3).</w:t>
       </w:r>
     </w:p>
     <w:tbl>
@@ -2771,7 +2781,7 @@
         <w:pStyle w:val="ListBullet"/>
       </w:pPr>
       <w:r>
-        <w:t>Balayage et évacuation quotidienne des poussières et déchets de chantier en fin de journée, avant réouverture éventuelle des circulations.</w:t>
+        <w:t>Balayage et évacuation quotidienne des poussières et déchets de chantier en fin de journée, avant réouverture éventuelle des circulations, ainsi qu'un nettoyage de chantier formalisé en fin de chaque semaine de production (fin de semaine Mois 4 - S1 pour les faux plafonds, S2 pour la peinture, S3 pour les sols), conformément à notre planning (chapitre 3).</w:t>
       </w:r>
     </w:p>
     <w:p>
@@ -2795,6 +2805,16 @@
         <w:t>2.7. Coordination avec l'AP-HP, la MOE et les autres corps d'état</w:t>
       </w:r>
     </w:p>
+    <w:p>
+      <w:r>
+        <w:rPr>
+          <w:b w:val="0"/>
+          <w:i w:val="0"/>
+          <w:sz w:val="21"/>
+        </w:rPr>
+        <w:t>La marge de planning ménagée entre la fin de nos travaux de production (Mois 4 - S3) et la clôture du lot (Mois 5 - S4) — cf. chapitre 3, § 3.5 — est notamment mise à profit pour intensifier ces points de coordination sans peser sur notre délai d'exécution.</w:t>
+      </w:r>
+    </w:p>
     <w:tbl>
       <w:tblPr>
         <w:tblStyle w:val="TableGrid"/>
@@ -2811,6 +2831,40 @@
       <w:tr>
         <w:tc>
           <w:tcPr>
+            <w:tcW w:type="dxa" w:w="2098"/>
+            <w:shd w:val="clear" w:color="auto" w:fill="2E74B5"/>
+          </w:tcPr>
+          <w:p>
+            <w:r/>
+            <w:r>
+              <w:rPr>
+                <w:b/>
+                <w:color w:val="FFFFFF"/>
+                <w:sz w:val="18"/>
+              </w:rPr>
+              <w:t>Instance de coordination</w:t>
+            </w:r>
+          </w:p>
+        </w:tc>
+        <w:tc>
+          <w:tcPr>
+            <w:tcW w:type="dxa" w:w="1984"/>
+            <w:shd w:val="clear" w:color="auto" w:fill="2E74B5"/>
+          </w:tcPr>
+          <w:p>
+            <w:r/>
+            <w:r>
+              <w:rPr>
+                <w:b/>
+                <w:color w:val="FFFFFF"/>
+                <w:sz w:val="18"/>
+              </w:rPr>
+              <w:t>Participants</w:t>
+            </w:r>
+          </w:p>
+        </w:tc>
+        <w:tc>
+          <w:tcPr>
             <w:tcW w:type="dxa" w:w="2268"/>
             <w:shd w:val="clear" w:color="auto" w:fill="2E74B5"/>
           </w:tcPr>
@@ -2822,13 +2876,13 @@
                 <w:color w:val="FFFFFF"/>
                 <w:sz w:val="18"/>
               </w:rPr>
-              <w:t>Instance de coordination</w:t>
-            </w:r>
-          </w:p>
-        </w:tc>
-        <w:tc>
-          <w:tcPr>
-            <w:tcW w:type="dxa" w:w="2268"/>
+              <w:t>Fréquence / semaine indicative</w:t>
+            </w:r>
+          </w:p>
+        </w:tc>
+        <w:tc>
+          <w:tcPr>
+            <w:tcW w:type="dxa" w:w="1871"/>
             <w:shd w:val="clear" w:color="auto" w:fill="2E74B5"/>
           </w:tcPr>
           <w:p>
@@ -2839,40 +2893,6 @@
                 <w:color w:val="FFFFFF"/>
                 <w:sz w:val="18"/>
               </w:rPr>
-              <w:t>Participants</w:t>
-            </w:r>
-          </w:p>
-        </w:tc>
-        <w:tc>
-          <w:tcPr>
-            <w:tcW w:type="dxa" w:w="1984"/>
-            <w:shd w:val="clear" w:color="auto" w:fill="2E74B5"/>
-          </w:tcPr>
-          <w:p>
-            <w:r/>
-            <w:r>
-              <w:rPr>
-                <w:b/>
-                <w:color w:val="FFFFFF"/>
-                <w:sz w:val="18"/>
-              </w:rPr>
-              <w:t>Fréquence</w:t>
-            </w:r>
-          </w:p>
-        </w:tc>
-        <w:tc>
-          <w:tcPr>
-            <w:tcW w:type="dxa" w:w="2268"/>
-            <w:shd w:val="clear" w:color="auto" w:fill="2E74B5"/>
-          </w:tcPr>
-          <w:p>
-            <w:r/>
-            <w:r>
-              <w:rPr>
-                <w:b/>
-                <w:color w:val="FFFFFF"/>
-                <w:sz w:val="18"/>
-              </w:rPr>
               <w:t>Objet</w:t>
             </w:r>
           </w:p>
@@ -2881,6 +2901,34 @@
       <w:tr>
         <w:tc>
           <w:tcPr>
+            <w:tcW w:type="dxa" w:w="2098"/>
+          </w:tcPr>
+          <w:p>
+            <w:r/>
+            <w:r>
+              <w:rPr>
+                <w:sz w:val="18"/>
+              </w:rPr>
+              <w:t>Réunion de chantier générale</w:t>
+            </w:r>
+          </w:p>
+        </w:tc>
+        <w:tc>
+          <w:tcPr>
+            <w:tcW w:type="dxa" w:w="1984"/>
+          </w:tcPr>
+          <w:p>
+            <w:r/>
+            <w:r>
+              <w:rPr>
+                <w:sz w:val="18"/>
+              </w:rPr>
+              <w:t>MOE, AP-HP, tous les lots</w:t>
+            </w:r>
+          </w:p>
+        </w:tc>
+        <w:tc>
+          <w:tcPr>
             <w:tcW w:type="dxa" w:w="2268"/>
           </w:tcPr>
           <w:p>
@@ -2889,41 +2937,13 @@
               <w:rPr>
                 <w:sz w:val="18"/>
               </w:rPr>
-              <w:t>Réunion de chantier générale</w:t>
-            </w:r>
-          </w:p>
-        </w:tc>
-        <w:tc>
-          <w:tcPr>
-            <w:tcW w:type="dxa" w:w="2268"/>
-          </w:tcPr>
-          <w:p>
-            <w:r/>
-            <w:r>
-              <w:rPr>
-                <w:sz w:val="18"/>
-              </w:rPr>
-              <w:t>MOE, AP-HP, tous les lots</w:t>
-            </w:r>
-          </w:p>
-        </w:tc>
-        <w:tc>
-          <w:tcPr>
-            <w:tcW w:type="dxa" w:w="1984"/>
-          </w:tcPr>
-          <w:p>
-            <w:r/>
-            <w:r>
-              <w:rPr>
-                <w:sz w:val="18"/>
-              </w:rPr>
-              <w:t>Hebdomadaire</w:t>
-            </w:r>
-          </w:p>
-        </w:tc>
-        <w:tc>
-          <w:tcPr>
-            <w:tcW w:type="dxa" w:w="2268"/>
+              <w:t>Hebdomadaire, dès Mois 1 - S4</w:t>
+            </w:r>
+          </w:p>
+        </w:tc>
+        <w:tc>
+          <w:tcPr>
+            <w:tcW w:type="dxa" w:w="1871"/>
           </w:tcPr>
           <w:p>
             <w:r/>
@@ -2939,6 +2959,34 @@
       <w:tr>
         <w:tc>
           <w:tcPr>
+            <w:tcW w:type="dxa" w:w="2098"/>
+          </w:tcPr>
+          <w:p>
+            <w:r/>
+            <w:r>
+              <w:rPr>
+                <w:sz w:val="18"/>
+              </w:rPr>
+              <w:t>Réunion de coordination technique inter-lots</w:t>
+            </w:r>
+          </w:p>
+        </w:tc>
+        <w:tc>
+          <w:tcPr>
+            <w:tcW w:type="dxa" w:w="1984"/>
+          </w:tcPr>
+          <w:p>
+            <w:r/>
+            <w:r>
+              <w:rPr>
+                <w:sz w:val="18"/>
+              </w:rPr>
+              <w:t>Lot 3 + lots 1/2/4/5/6 concernés</w:t>
+            </w:r>
+          </w:p>
+        </w:tc>
+        <w:tc>
+          <w:tcPr>
             <w:tcW w:type="dxa" w:w="2268"/>
           </w:tcPr>
           <w:p>
@@ -2947,41 +2995,13 @@
               <w:rPr>
                 <w:sz w:val="18"/>
               </w:rPr>
-              <w:t>Réunion de coordination technique inter-lots</w:t>
-            </w:r>
-          </w:p>
-        </w:tc>
-        <w:tc>
-          <w:tcPr>
-            <w:tcW w:type="dxa" w:w="2268"/>
-          </w:tcPr>
-          <w:p>
-            <w:r/>
-            <w:r>
-              <w:rPr>
-                <w:sz w:val="18"/>
-              </w:rPr>
-              <w:t>Lot 3 + lots 1/2/4/5/6 concernés</w:t>
-            </w:r>
-          </w:p>
-        </w:tc>
-        <w:tc>
-          <w:tcPr>
-            <w:tcW w:type="dxa" w:w="1984"/>
-          </w:tcPr>
-          <w:p>
-            <w:r/>
-            <w:r>
-              <w:rPr>
-                <w:sz w:val="18"/>
-              </w:rPr>
-              <w:t>Selon phasage (avant chaque intervention en interface)</w:t>
-            </w:r>
-          </w:p>
-        </w:tc>
-        <w:tc>
-          <w:tcPr>
-            <w:tcW w:type="dxa" w:w="2268"/>
+              <w:t>Avant chaque phase (Mois 4 - S1, S2, S3)</w:t>
+            </w:r>
+          </w:p>
+        </w:tc>
+        <w:tc>
+          <w:tcPr>
+            <w:tcW w:type="dxa" w:w="1871"/>
           </w:tcPr>
           <w:p>
             <w:r/>
@@ -2997,6 +3017,34 @@
       <w:tr>
         <w:tc>
           <w:tcPr>
+            <w:tcW w:type="dxa" w:w="2098"/>
+          </w:tcPr>
+          <w:p>
+            <w:r/>
+            <w:r>
+              <w:rPr>
+                <w:sz w:val="18"/>
+              </w:rPr>
+              <w:t>Point de coordination SSI</w:t>
+            </w:r>
+          </w:p>
+        </w:tc>
+        <w:tc>
+          <w:tcPr>
+            <w:tcW w:type="dxa" w:w="1984"/>
+          </w:tcPr>
+          <w:p>
+            <w:r/>
+            <w:r>
+              <w:rPr>
+                <w:sz w:val="18"/>
+              </w:rPr>
+              <w:t>Coordonnateur SSI (CS Ingénierie), Lot 3</w:t>
+            </w:r>
+          </w:p>
+        </w:tc>
+        <w:tc>
+          <w:tcPr>
             <w:tcW w:type="dxa" w:w="2268"/>
           </w:tcPr>
           <w:p>
@@ -3005,41 +3053,13 @@
               <w:rPr>
                 <w:sz w:val="18"/>
               </w:rPr>
-              <w:t>Point de coordination SSI</w:t>
-            </w:r>
-          </w:p>
-        </w:tc>
-        <w:tc>
-          <w:tcPr>
-            <w:tcW w:type="dxa" w:w="2268"/>
-          </w:tcPr>
-          <w:p>
-            <w:r/>
-            <w:r>
-              <w:rPr>
-                <w:sz w:val="18"/>
-              </w:rPr>
-              <w:t>Coordonnateur SSI (CS Ingénierie), Lot 3</w:t>
-            </w:r>
-          </w:p>
-        </w:tc>
-        <w:tc>
-          <w:tcPr>
-            <w:tcW w:type="dxa" w:w="1984"/>
-          </w:tcPr>
-          <w:p>
-            <w:r/>
-            <w:r>
-              <w:rPr>
-                <w:sz w:val="18"/>
-              </w:rPr>
-              <w:t>À chaque intervention sur cloisons/plénums sensibles</w:t>
-            </w:r>
-          </w:p>
-        </w:tc>
-        <w:tc>
-          <w:tcPr>
-            <w:tcW w:type="dxa" w:w="2268"/>
+              <w:t>À chaque intervention sur cloisons/plénums sensibles (Mois 4 - S1)</w:t>
+            </w:r>
+          </w:p>
+        </w:tc>
+        <w:tc>
+          <w:tcPr>
+            <w:tcW w:type="dxa" w:w="1871"/>
           </w:tcPr>
           <w:p>
             <w:r/>
@@ -3055,6 +3075,34 @@
       <w:tr>
         <w:tc>
           <w:tcPr>
+            <w:tcW w:type="dxa" w:w="2098"/>
+          </w:tcPr>
+          <w:p>
+            <w:r/>
+            <w:r>
+              <w:rPr>
+                <w:sz w:val="18"/>
+              </w:rPr>
+              <w:t>Point de coordination SPS</w:t>
+            </w:r>
+          </w:p>
+        </w:tc>
+        <w:tc>
+          <w:tcPr>
+            <w:tcW w:type="dxa" w:w="1984"/>
+          </w:tcPr>
+          <w:p>
+            <w:r/>
+            <w:r>
+              <w:rPr>
+                <w:sz w:val="18"/>
+              </w:rPr>
+              <w:t>Coordonnateur SPS (SOCOTEC), Lot 3</w:t>
+            </w:r>
+          </w:p>
+        </w:tc>
+        <w:tc>
+          <w:tcPr>
             <w:tcW w:type="dxa" w:w="2268"/>
           </w:tcPr>
           <w:p>
@@ -3063,41 +3111,13 @@
               <w:rPr>
                 <w:sz w:val="18"/>
               </w:rPr>
-              <w:t>Point de coordination SPS</w:t>
-            </w:r>
-          </w:p>
-        </w:tc>
-        <w:tc>
-          <w:tcPr>
-            <w:tcW w:type="dxa" w:w="2268"/>
-          </w:tcPr>
-          <w:p>
-            <w:r/>
-            <w:r>
-              <w:rPr>
-                <w:sz w:val="18"/>
-              </w:rPr>
-              <w:t>Coordonnateur SPS (SOCOTEC), Lot 3</w:t>
-            </w:r>
-          </w:p>
-        </w:tc>
-        <w:tc>
-          <w:tcPr>
-            <w:tcW w:type="dxa" w:w="1984"/>
-          </w:tcPr>
-          <w:p>
-            <w:r/>
-            <w:r>
-              <w:rPr>
-                <w:sz w:val="18"/>
-              </w:rPr>
-              <w:t>Selon PGC / inspection commune</w:t>
-            </w:r>
-          </w:p>
-        </w:tc>
-        <w:tc>
-          <w:tcPr>
-            <w:tcW w:type="dxa" w:w="2268"/>
+              <w:t>Selon PGC / inspection commune, dès Mois 1 - S4</w:t>
+            </w:r>
+          </w:p>
+        </w:tc>
+        <w:tc>
+          <w:tcPr>
+            <w:tcW w:type="dxa" w:w="1871"/>
           </w:tcPr>
           <w:p>
             <w:r/>
@@ -3113,6 +3133,34 @@
       <w:tr>
         <w:tc>
           <w:tcPr>
+            <w:tcW w:type="dxa" w:w="2098"/>
+          </w:tcPr>
+          <w:p>
+            <w:r/>
+            <w:r>
+              <w:rPr>
+                <w:sz w:val="18"/>
+              </w:rPr>
+              <w:t>Point d'arrêt structurel</w:t>
+            </w:r>
+          </w:p>
+        </w:tc>
+        <w:tc>
+          <w:tcPr>
+            <w:tcW w:type="dxa" w:w="1984"/>
+          </w:tcPr>
+          <w:p>
+            <w:r/>
+            <w:r>
+              <w:rPr>
+                <w:sz w:val="18"/>
+              </w:rPr>
+              <w:t>MOE, Lot 1, Lot 3</w:t>
+            </w:r>
+          </w:p>
+        </w:tc>
+        <w:tc>
+          <w:tcPr>
             <w:tcW w:type="dxa" w:w="2268"/>
           </w:tcPr>
           <w:p>
@@ -3121,7 +3169,51 @@
               <w:rPr>
                 <w:sz w:val="18"/>
               </w:rPr>
-              <w:t>Point d'arrêt structurel</w:t>
+              <w:t>Avant Mois 4 - S1 (zone scanner)</w:t>
+            </w:r>
+          </w:p>
+        </w:tc>
+        <w:tc>
+          <w:tcPr>
+            <w:tcW w:type="dxa" w:w="1871"/>
+          </w:tcPr>
+          <w:p>
+            <w:r/>
+            <w:r>
+              <w:rPr>
+                <w:sz w:val="18"/>
+              </w:rPr>
+              <w:t>Réception contradictoire du renfort HEB220</w:t>
+            </w:r>
+          </w:p>
+        </w:tc>
+      </w:tr>
+      <w:tr>
+        <w:tc>
+          <w:tcPr>
+            <w:tcW w:type="dxa" w:w="2098"/>
+          </w:tcPr>
+          <w:p>
+            <w:r/>
+            <w:r>
+              <w:rPr>
+                <w:sz w:val="18"/>
+              </w:rPr>
+              <w:t>Point de coordination de marge</w:t>
+            </w:r>
+          </w:p>
+        </w:tc>
+        <w:tc>
+          <w:tcPr>
+            <w:tcW w:type="dxa" w:w="1984"/>
+          </w:tcPr>
+          <w:p>
+            <w:r/>
+            <w:r>
+              <w:rPr>
+                <w:sz w:val="18"/>
+              </w:rPr>
+              <w:t>MOE, AP-HP, Lot 3</w:t>
             </w:r>
           </w:p>
         </w:tc>
@@ -3135,35 +3227,21 @@
               <w:rPr>
                 <w:sz w:val="18"/>
               </w:rPr>
-              <w:t>MOE, Lot 1, Lot 3</w:t>
-            </w:r>
-          </w:p>
-        </w:tc>
-        <w:tc>
-          <w:tcPr>
-            <w:tcW w:type="dxa" w:w="1984"/>
-          </w:tcPr>
-          <w:p>
-            <w:r/>
-            <w:r>
-              <w:rPr>
-                <w:sz w:val="18"/>
-              </w:rPr>
-              <w:t>Avant intervention en zone scanner</w:t>
-            </w:r>
-          </w:p>
-        </w:tc>
-        <w:tc>
-          <w:tcPr>
-            <w:tcW w:type="dxa" w:w="2268"/>
-          </w:tcPr>
-          <w:p>
-            <w:r/>
-            <w:r>
-              <w:rPr>
-                <w:sz w:val="18"/>
-              </w:rPr>
-              <w:t>Réception contradictoire du renfort HEB220</w:t>
+              <w:t>Mois 4 - S4 à Mois 5 - S3</w:t>
+            </w:r>
+          </w:p>
+        </w:tc>
+        <w:tc>
+          <w:tcPr>
+            <w:tcW w:type="dxa" w:w="1871"/>
+          </w:tcPr>
+          <w:p>
+            <w:r/>
+            <w:r>
+              <w:rPr>
+                <w:sz w:val="18"/>
+              </w:rPr>
+              <w:t>Ajustement fin du planning, absorption des aléas éventuels</w:t>
             </w:r>
           </w:p>
         </w:tc>
@@ -3195,7 +3273,7 @@
           <w:i w:val="0"/>
           <w:sz w:val="21"/>
         </w:rPr>
-        <w:t>La mise en œuvre des faux plafonds respecte les DTU 25.221 à 25.51 et 58.1 ainsi que les prescriptions particulières du CCTP (Art. III.2), notamment en matière de tenue au feu, de planéité et de coordination avec les autres corps d'état pour les réservations.</w:t>
+        <w:t>La mise en œuvre des faux plafonds respecte les DTU 25.221 à 25.51 et 58.1 ainsi que les prescriptions particulières du CCTP (Art. III.2), notamment en matière de tenue au feu, de planéité et de coordination avec les autres corps d'état pour les réservations. Cette phase est positionnée en semaine Mois 4 - S1 de notre planning (chapitre 3), avec un effectif de 3 personnes.</w:t>
       </w:r>
     </w:p>
     <w:p>
@@ -3548,7 +3626,7 @@
           <w:i w:val="0"/>
           <w:sz w:val="21"/>
         </w:rPr>
-        <w:t>Les travaux de peinture sont exécutés conformément aux DTU 59.1 et 59.4 et aux spécifications techniques U.N.P., avec des systèmes à très faible émission de C.O.V. certifiés Ecolabel : Indeko Bio Fix / Indeko Satin (Caparol) pour les murs, Muroprim / Garnysatin S2P (Seigneurie) pour plafonds, boiseries, métaux et PVC (Art. III.3.02 et IV.6 du CCTP).</w:t>
+        <w:t>Les travaux de peinture sont exécutés conformément aux DTU 59.1 et 59.4 et aux spécifications techniques U.N.P., avec des systèmes à très faible émission de C.O.V. certifiés Ecolabel : Indeko Bio Fix / Indeko Satin (Caparol) pour les murs, Muroprim / Garnysatin S2P (Seigneurie) pour plafonds, boiseries, métaux et PVC (Art. III.3.02 et IV.6 du CCTP). Cette phase est positionnée en semaine Mois 4 - S2 de notre planning (chapitre 3), après les faux plafonds et avant les sols souples, avec un effectif de 3 personnes.</w:t>
       </w:r>
     </w:p>
     <w:p>
@@ -4199,7 +4277,7 @@
           <w:i w:val="0"/>
           <w:sz w:val="21"/>
         </w:rPr>
-        <w:t>Les revêtements de sols souples sont posés conformément au DTU 53.2 et aux prescriptions particulières du CCTP (Art. III.4 et IV.8), sur chapes béton surfacé livrées par le lot Maçonnerie ou sur plancher/dalles existantes.</w:t>
+        <w:t>Les revêtements de sols souples sont posés conformément au DTU 53.2 et aux prescriptions particulières du CCTP (Art. III.4 et IV.8), sur chapes béton surfacé livrées par le lot Maçonnerie ou sur plancher/dalles existantes. Cette phase est positionnée en semaine Mois 4 - S3 de notre planning (chapitre 3), en toute fin de séquence du lot afin de préserver les revêtements fraîchement posés, avec un effectif de 2 personnes.</w:t>
       </w:r>
     </w:p>
     <w:p>
@@ -5217,7 +5295,7 @@
           <w:i w:val="0"/>
           <w:sz w:val="21"/>
         </w:rPr>
-        <w:t>En fin d'opération, un nettoyage complet des locaux visés au projet est réalisé (Art. IV.7 et III.3.03 du CCTP), portant notamment sur les sols, revêtements verticaux, quincaillerie, appareils sanitaires et électriques, vitres et menuiseries — ce nettoyage est inclus au prix global forfaitaire du lot.</w:t>
+        <w:t>En fin d'opération, un nettoyage complet des locaux visés au projet est réalisé (Art. IV.7 et III.3.03 du CCTP), portant notamment sur les sols, revêtements verticaux, quincaillerie, appareils sanitaires et électriques, vitres et menuiseries — ce nettoyage est inclus au prix global forfaitaire du lot. Cette clôture du lot est positionnée en semaine Mois 5 - S4 de notre planning (chapitre 3) : 2 jours de nettoyage général, 1 jour d'OPR et 1 jour de levée des réserves, avec un effectif de 2 personnes.</w:t>
       </w:r>
     </w:p>
     <w:tbl>
@@ -5310,7 +5388,7 @@
               <w:rPr>
                 <w:sz w:val="18"/>
               </w:rPr>
-              <w:t>Balayage et évacuation quotidienne des déchets/sciure des zones d'intervention</w:t>
+              <w:t>Balayage et évacuation quotidienne des déchets/sciure des zones d'intervention, en fin de chaque semaine de production (Mois 4 - S1/S2/S3)</w:t>
             </w:r>
           </w:p>
         </w:tc>
@@ -5340,7 +5418,7 @@
               <w:rPr>
                 <w:sz w:val="18"/>
               </w:rPr>
-              <w:t>Nettoyage général de fin de chantier</w:t>
+              <w:t>Nettoyage général de fin de chantier (2 jours)</w:t>
             </w:r>
           </w:p>
         </w:tc>
@@ -5354,7 +5432,7 @@
               <w:rPr>
                 <w:sz w:val="18"/>
               </w:rPr>
-              <w:t>Sols, murs, quincaillerie, sanitaires, menuiseries, vitres — hors ponçage sur surfaces émaillées/stratifiées</w:t>
+              <w:t>Sols, murs, quincaillerie, sanitaires, menuiseries, vitres — hors ponçage sur surfaces émaillées/stratifiées — Mois 5 - S4</w:t>
             </w:r>
           </w:p>
         </w:tc>
@@ -5384,7 +5462,7 @@
               <w:rPr>
                 <w:sz w:val="18"/>
               </w:rPr>
-              <w:t>Opérations Préalables à la Réception (OPR)</w:t>
+              <w:t>Opérations Préalables à la Réception — OPR (1 jour)</w:t>
             </w:r>
           </w:p>
         </w:tc>
@@ -5398,7 +5476,7 @@
               <w:rPr>
                 <w:sz w:val="18"/>
               </w:rPr>
-              <w:t>Auto-contrôles formalisés, présentation des ouvrages, essais/vérifications par local</w:t>
+              <w:t>Auto-contrôles formalisés, présentation des ouvrages, essais/vérifications par local — Mois 5 - S4</w:t>
             </w:r>
           </w:p>
         </w:tc>
@@ -5428,7 +5506,7 @@
               <w:rPr>
                 <w:sz w:val="18"/>
               </w:rPr>
-              <w:t>Réception globale « tous corps d'état »</w:t>
+              <w:t>Levée des réserves (1 jour)</w:t>
             </w:r>
           </w:p>
         </w:tc>
@@ -5442,7 +5520,7 @@
               <w:rPr>
                 <w:sz w:val="18"/>
               </w:rPr>
-              <w:t>Prononcée après achèvement de l'ensemble des lots, avis favorable de la commission de sécurité et fonctionnement GTB/GTE</w:t>
+              <w:t>Traitement sous délai court après notification, avant ouverture au public / passage commission de sécurité — Mois 5 - S4</w:t>
             </w:r>
           </w:p>
         </w:tc>
@@ -5456,7 +5534,7 @@
               <w:rPr>
                 <w:sz w:val="18"/>
               </w:rPr>
-              <w:t>CCAP Art. XV.01</w:t>
+              <w:t>CCAP Art. XIV.03(d)</w:t>
             </w:r>
           </w:p>
         </w:tc>
@@ -5472,7 +5550,7 @@
               <w:rPr>
                 <w:sz w:val="18"/>
               </w:rPr>
-              <w:t>Levée des réserves</w:t>
+              <w:t>Réception globale « tous corps d'état »</w:t>
             </w:r>
           </w:p>
         </w:tc>
@@ -5486,7 +5564,7 @@
               <w:rPr>
                 <w:sz w:val="18"/>
               </w:rPr>
-              <w:t>Traitement sous délai court après notification, avant ouverture au public / passage commission de sécurité</w:t>
+              <w:t>Prononcée après achèvement de l'ensemble des lots, avis favorable de la commission de sécurité et fonctionnement GTB/GTE</w:t>
             </w:r>
           </w:p>
         </w:tc>
@@ -5500,7 +5578,7 @@
               <w:rPr>
                 <w:sz w:val="18"/>
               </w:rPr>
-              <w:t>CCAP Art. XIV.03(d)</w:t>
+              <w:t>CCAP Art. XV.01</w:t>
             </w:r>
           </w:p>
         </w:tc>

</xml_diff>

<commit_message>
Convertit les méthodologies §2.8-2.10 en tableaux et retire les citations CCTP
Toutes les sous-sections méthodologie (faux plafonds, peinture, sols
souples) sont désormais présentées sous forme de tableaux d'étapes,
et les renvois explicites aux articles du CCTP sont retirés du texte
pour que le mémoire technique s'exprime comme la méthodologie propre
de France Décoration plutôt que comme une paraphrase du CCTP.

Co-Authored-By: Claude Sonnet 5 <noreply@anthropic.com>
Claude-Session: https://claude.ai/code/session_016J8ZBxzUkBqS3C16QP9P63
</commit_message>
<xml_diff>
--- a/livrables/Lot3_Chapitre2_Organisation_Methodologie.docx
+++ b/livrables/Lot3_Chapitre2_Organisation_Methodologie.docx
@@ -3273,7 +3273,7 @@
           <w:i w:val="0"/>
           <w:sz w:val="21"/>
         </w:rPr>
-        <w:t>La mise en œuvre des faux plafonds respecte les DTU 25.221 à 25.51 et 58.1 ainsi que les prescriptions particulières du CCTP (Art. III.2), notamment en matière de tenue au feu, de planéité et de coordination avec les autres corps d'état pour les réservations. Cette phase est positionnée en semaine Mois 4 - S1 de notre planning (chapitre 3), avec un effectif de 3 personnes.</w:t>
+        <w:t>La mise en œuvre des faux plafonds respecte les DTU 25.221 à 25.51 et 58.1, notamment en matière de tenue au feu, de planéité et de coordination avec les autres corps d'état pour les réservations. Cette phase est positionnée en semaine Mois 4 - S1 de notre planning (chapitre 3), avec un effectif de 3 personnes.</w:t>
       </w:r>
     </w:p>
     <w:p>
@@ -3294,10 +3294,10 @@
       <w:r>
         <w:rPr>
           <w:b w:val="0"/>
-          <w:i w:val="0"/>
+          <w:i/>
           <w:sz w:val="21"/>
         </w:rPr>
-        <w:t>Ouvrage prescrit à l'article IV.1 du CCTP, mis en œuvre dans les locaux courants (sanitaires, LT électrique, secrétariat, salle de détente…).</w:t>
+        <w:t>Mis en œuvre dans les locaux courants (sanitaires, LT électrique, secrétariat, salle de détente…), dalles Akutex HS 600x600, épaisseur 20mm.</w:t>
       </w:r>
     </w:p>
     <w:tbl>
@@ -3522,7 +3522,7 @@
               <w:rPr>
                 <w:sz w:val="18"/>
               </w:rPr>
-              <w:t>Vérification à la règle de 2m — tolérance 3mm (Art. III.2.02.5)</w:t>
+              <w:t>Vérification à la règle de 2m — tolérance 3mm</w:t>
             </w:r>
           </w:p>
         </w:tc>
@@ -3547,12 +3547,271 @@
       <w:r>
         <w:rPr>
           <w:b w:val="0"/>
-          <w:i w:val="0"/>
+          <w:i/>
           <w:sz w:val="21"/>
         </w:rPr>
-        <w:t>Mis en œuvre selon la même méthodologie que le § 2.8.1 (Art. IV.2 du CCTP), dans les locaux à plus haute exigence hygiénique (scanner, salle claire, accès accueil radio, déshabilloirs) : dalles Akutex HP à bords peints, classement d'absorption B, résistance au feu A2-s1,d0. Une attention particulière est portée à la coordination avec les fluides médicaux susceptibles de transiter en plénum dans ces locaux.</w:t>
+        <w:t>Mis en œuvre dans les locaux à plus haute exigence hygiénique (scanner, salle claire, accès accueil radio, déshabilloirs), dalles Akutex HP à bords peints, classement d'absorption B, résistance au feu A2-s1,d0.</w:t>
       </w:r>
     </w:p>
+    <w:tbl>
+      <w:tblPr>
+        <w:tblStyle w:val="TableGrid"/>
+        <w:tblW w:type="auto" w:w="0"/>
+        <w:jc w:val="center"/>
+        <w:tblLook w:firstColumn="1" w:firstRow="1" w:lastColumn="0" w:lastRow="0" w:noHBand="0" w:noVBand="1" w:val="04A0"/>
+      </w:tblPr>
+      <w:tblGrid>
+        <w:gridCol w:w="4986"/>
+        <w:gridCol w:w="4986"/>
+      </w:tblGrid>
+      <w:tr>
+        <w:tc>
+          <w:tcPr>
+            <w:tcW w:type="dxa" w:w="2551"/>
+            <w:shd w:val="clear" w:color="auto" w:fill="2E74B5"/>
+          </w:tcPr>
+          <w:p>
+            <w:r/>
+            <w:r>
+              <w:rPr>
+                <w:b/>
+                <w:color w:val="FFFFFF"/>
+                <w:sz w:val="18"/>
+              </w:rPr>
+              <w:t>Étape</w:t>
+            </w:r>
+          </w:p>
+        </w:tc>
+        <w:tc>
+          <w:tcPr>
+            <w:tcW w:type="dxa" w:w="5953"/>
+            <w:shd w:val="clear" w:color="auto" w:fill="2E74B5"/>
+          </w:tcPr>
+          <w:p>
+            <w:r/>
+            <w:r>
+              <w:rPr>
+                <w:b/>
+                <w:color w:val="FFFFFF"/>
+                <w:sz w:val="18"/>
+              </w:rPr>
+              <w:t>Description</w:t>
+            </w:r>
+          </w:p>
+        </w:tc>
+      </w:tr>
+      <w:tr>
+        <w:tc>
+          <w:tcPr>
+            <w:tcW w:type="dxa" w:w="2551"/>
+          </w:tcPr>
+          <w:p>
+            <w:r/>
+            <w:r>
+              <w:rPr>
+                <w:sz w:val="18"/>
+              </w:rPr>
+              <w:t>1. Traçage et implantation</w:t>
+            </w:r>
+          </w:p>
+        </w:tc>
+        <w:tc>
+          <w:tcPr>
+            <w:tcW w:type="dxa" w:w="5953"/>
+          </w:tcPr>
+          <w:p>
+            <w:r/>
+            <w:r>
+              <w:rPr>
+                <w:sz w:val="18"/>
+              </w:rPr>
+              <w:t>Report du calepinage validé par le MOE, niveaux à laser</w:t>
+            </w:r>
+          </w:p>
+        </w:tc>
+      </w:tr>
+      <w:tr>
+        <w:tc>
+          <w:tcPr>
+            <w:tcW w:type="dxa" w:w="2551"/>
+          </w:tcPr>
+          <w:p>
+            <w:r/>
+            <w:r>
+              <w:rPr>
+                <w:sz w:val="18"/>
+              </w:rPr>
+              <w:t>2. Pose des suspentes</w:t>
+            </w:r>
+          </w:p>
+        </w:tc>
+        <w:tc>
+          <w:tcPr>
+            <w:tcW w:type="dxa" w:w="5953"/>
+          </w:tcPr>
+          <w:p>
+            <w:r/>
+            <w:r>
+              <w:rPr>
+                <w:sz w:val="18"/>
+              </w:rPr>
+              <w:t>Suspente réglable tous les 1200mm (distance max. mur 600mm)</w:t>
+            </w:r>
+          </w:p>
+        </w:tc>
+      </w:tr>
+      <w:tr>
+        <w:tc>
+          <w:tcPr>
+            <w:tcW w:type="dxa" w:w="2551"/>
+          </w:tcPr>
+          <w:p>
+            <w:r/>
+            <w:r>
+              <w:rPr>
+                <w:sz w:val="18"/>
+              </w:rPr>
+              <w:t>3. Pose de l'ossature</w:t>
+            </w:r>
+          </w:p>
+        </w:tc>
+        <w:tc>
+          <w:tcPr>
+            <w:tcW w:type="dxa" w:w="5953"/>
+          </w:tcPr>
+          <w:p>
+            <w:r/>
+            <w:r>
+              <w:rPr>
+                <w:sz w:val="18"/>
+              </w:rPr>
+              <w:t>Profil porteur T24 tous les 1200mm + entretoises tous les 600mm ; coulisse de rive vissée tous les 300mm</w:t>
+            </w:r>
+          </w:p>
+        </w:tc>
+      </w:tr>
+      <w:tr>
+        <w:tc>
+          <w:tcPr>
+            <w:tcW w:type="dxa" w:w="2551"/>
+          </w:tcPr>
+          <w:p>
+            <w:r/>
+            <w:r>
+              <w:rPr>
+                <w:sz w:val="18"/>
+              </w:rPr>
+              <w:t>4. Coordination fluides médicaux</w:t>
+            </w:r>
+          </w:p>
+        </w:tc>
+        <w:tc>
+          <w:tcPr>
+            <w:tcW w:type="dxa" w:w="5953"/>
+          </w:tcPr>
+          <w:p>
+            <w:r/>
+            <w:r>
+              <w:rPr>
+                <w:sz w:val="18"/>
+              </w:rPr>
+              <w:t>Vérification des passages de réseaux de fluides médicaux en plénum avant fermeture, en lien avec le Lot 6</w:t>
+            </w:r>
+          </w:p>
+        </w:tc>
+      </w:tr>
+      <w:tr>
+        <w:tc>
+          <w:tcPr>
+            <w:tcW w:type="dxa" w:w="2551"/>
+          </w:tcPr>
+          <w:p>
+            <w:r/>
+            <w:r>
+              <w:rPr>
+                <w:sz w:val="18"/>
+              </w:rPr>
+              <w:t>5. Réservations</w:t>
+            </w:r>
+          </w:p>
+        </w:tc>
+        <w:tc>
+          <w:tcPr>
+            <w:tcW w:type="dxa" w:w="5953"/>
+          </w:tcPr>
+          <w:p>
+            <w:r/>
+            <w:r>
+              <w:rPr>
+                <w:sz w:val="18"/>
+              </w:rPr>
+              <w:t>Découpes coordonnées avec les lots techniques (luminaires, bouches, détecteurs, trappes)</w:t>
+            </w:r>
+          </w:p>
+        </w:tc>
+      </w:tr>
+      <w:tr>
+        <w:tc>
+          <w:tcPr>
+            <w:tcW w:type="dxa" w:w="2551"/>
+          </w:tcPr>
+          <w:p>
+            <w:r/>
+            <w:r>
+              <w:rPr>
+                <w:sz w:val="18"/>
+              </w:rPr>
+              <w:t>6. Pose des dalles Akutex HP</w:t>
+            </w:r>
+          </w:p>
+        </w:tc>
+        <w:tc>
+          <w:tcPr>
+            <w:tcW w:type="dxa" w:w="5953"/>
+          </w:tcPr>
+          <w:p>
+            <w:r/>
+            <w:r>
+              <w:rPr>
+                <w:sz w:val="18"/>
+              </w:rPr>
+              <w:t>600x600, ép. 20mm, bords peints, coupes d'onglets aux changements de direction</w:t>
+            </w:r>
+          </w:p>
+        </w:tc>
+      </w:tr>
+      <w:tr>
+        <w:tc>
+          <w:tcPr>
+            <w:tcW w:type="dxa" w:w="2551"/>
+          </w:tcPr>
+          <w:p>
+            <w:r/>
+            <w:r>
+              <w:rPr>
+                <w:sz w:val="18"/>
+              </w:rPr>
+              <w:t>7. Contrôle planéité</w:t>
+            </w:r>
+          </w:p>
+        </w:tc>
+        <w:tc>
+          <w:tcPr>
+            <w:tcW w:type="dxa" w:w="5953"/>
+          </w:tcPr>
+          <w:p>
+            <w:r/>
+            <w:r>
+              <w:rPr>
+                <w:sz w:val="18"/>
+              </w:rPr>
+              <w:t>Vérification à la règle de 2m — tolérance 3mm</w:t>
+            </w:r>
+          </w:p>
+        </w:tc>
+      </w:tr>
+    </w:tbl>
+    <w:p/>
     <w:p>
       <w:pPr>
         <w:spacing w:before="160" w:after="60"/>
@@ -3567,16 +3826,115 @@
         <w:t>2.8.3. Jouées et grilles de ventilation</w:t>
       </w:r>
     </w:p>
-    <w:p>
-      <w:r>
-        <w:rPr>
-          <w:b w:val="0"/>
-          <w:i w:val="0"/>
-          <w:sz w:val="21"/>
-        </w:rPr>
-        <w:t>Les jouées en plaque de plâtre BA13 Placostil (Art. IV.3, provision 20 ml x 0,60m) assurent la liaison entre plafonds de niveaux différents et la fermeture des plénums : pose sur ossature dédiée, traitement des joints et finitions avant réception. Les grilles de ventilation en aluminium laqué (Art. IV.4, provision 5 unités) sont posées aux emplacements et selon le modèle validés par le MOE, en fonction de la présence de réseaux de fluides médicaux dans les plénums.</w:t>
-      </w:r>
-    </w:p>
+    <w:tbl>
+      <w:tblPr>
+        <w:tblStyle w:val="TableGrid"/>
+        <w:tblW w:type="auto" w:w="0"/>
+        <w:jc w:val="center"/>
+        <w:tblLook w:firstColumn="1" w:firstRow="1" w:lastColumn="0" w:lastRow="0" w:noHBand="0" w:noVBand="1" w:val="04A0"/>
+      </w:tblPr>
+      <w:tblGrid>
+        <w:gridCol w:w="4986"/>
+        <w:gridCol w:w="4986"/>
+      </w:tblGrid>
+      <w:tr>
+        <w:tc>
+          <w:tcPr>
+            <w:tcW w:type="dxa" w:w="2551"/>
+            <w:shd w:val="clear" w:color="auto" w:fill="2E74B5"/>
+          </w:tcPr>
+          <w:p>
+            <w:r/>
+            <w:r>
+              <w:rPr>
+                <w:b/>
+                <w:color w:val="FFFFFF"/>
+                <w:sz w:val="18"/>
+              </w:rPr>
+              <w:t>Ouvrage</w:t>
+            </w:r>
+          </w:p>
+        </w:tc>
+        <w:tc>
+          <w:tcPr>
+            <w:tcW w:type="dxa" w:w="5953"/>
+            <w:shd w:val="clear" w:color="auto" w:fill="2E74B5"/>
+          </w:tcPr>
+          <w:p>
+            <w:r/>
+            <w:r>
+              <w:rPr>
+                <w:b/>
+                <w:color w:val="FFFFFF"/>
+                <w:sz w:val="18"/>
+              </w:rPr>
+              <w:t>Méthode d'exécution</w:t>
+            </w:r>
+          </w:p>
+        </w:tc>
+      </w:tr>
+      <w:tr>
+        <w:tc>
+          <w:tcPr>
+            <w:tcW w:type="dxa" w:w="2551"/>
+          </w:tcPr>
+          <w:p>
+            <w:r/>
+            <w:r>
+              <w:rPr>
+                <w:sz w:val="18"/>
+              </w:rPr>
+              <w:t>Jouées (plaque de plâtre BA13)</w:t>
+            </w:r>
+          </w:p>
+        </w:tc>
+        <w:tc>
+          <w:tcPr>
+            <w:tcW w:type="dxa" w:w="5953"/>
+          </w:tcPr>
+          <w:p>
+            <w:r/>
+            <w:r>
+              <w:rPr>
+                <w:sz w:val="18"/>
+              </w:rPr>
+              <w:t>Pose d'une ossature dédiée (montants Stil) → fixation des plaques (vis TTPC 25) → traitement des joints (Placojoint PR4 + bande PP) → finitions, pour assurer la liaison entre plafonds de niveaux différents et la fermeture des plénums (provision 20 ml x 0,60m)</w:t>
+            </w:r>
+          </w:p>
+        </w:tc>
+      </w:tr>
+      <w:tr>
+        <w:tc>
+          <w:tcPr>
+            <w:tcW w:type="dxa" w:w="2551"/>
+          </w:tcPr>
+          <w:p>
+            <w:r/>
+            <w:r>
+              <w:rPr>
+                <w:sz w:val="18"/>
+              </w:rPr>
+              <w:t>Grilles de ventilation plénum</w:t>
+            </w:r>
+          </w:p>
+        </w:tc>
+        <w:tc>
+          <w:tcPr>
+            <w:tcW w:type="dxa" w:w="5953"/>
+          </w:tcPr>
+          <w:p>
+            <w:r/>
+            <w:r>
+              <w:rPr>
+                <w:sz w:val="18"/>
+              </w:rPr>
+              <w:t>Validation du modèle et des emplacements avec le MOE selon la présence de réseaux de fluides médicaux dans les plénums → pose des grilles aluminium laqué (provision 5 unités)</w:t>
+            </w:r>
+          </w:p>
+        </w:tc>
+      </w:tr>
+    </w:tbl>
+    <w:p/>
     <w:p>
       <w:pPr>
         <w:spacing w:before="160" w:after="60"/>
@@ -3591,16 +3949,205 @@
         <w:t>2.8.4. Dépose et repose ponctuelle des faux plafonds existants</w:t>
       </w:r>
     </w:p>
-    <w:p>
-      <w:r>
-        <w:rPr>
-          <w:b w:val="0"/>
-          <w:i w:val="0"/>
-          <w:sz w:val="21"/>
-        </w:rPr>
-        <w:t>Conformément à l'article IV.5 du CCTP (provision 67 m²), un constat contradictoire est réalisé avant toute dépose des faux plafonds existants conservés. La dépose s'accompagne du remplacement des dalles et éléments d'ossature en mauvais état ; les réservations nécessaires aux équipements des lots techniques sont réalisées à cette occasion.</w:t>
-      </w:r>
-    </w:p>
+    <w:tbl>
+      <w:tblPr>
+        <w:tblStyle w:val="TableGrid"/>
+        <w:tblW w:type="auto" w:w="0"/>
+        <w:jc w:val="center"/>
+        <w:tblLook w:firstColumn="1" w:firstRow="1" w:lastColumn="0" w:lastRow="0" w:noHBand="0" w:noVBand="1" w:val="04A0"/>
+      </w:tblPr>
+      <w:tblGrid>
+        <w:gridCol w:w="4986"/>
+        <w:gridCol w:w="4986"/>
+      </w:tblGrid>
+      <w:tr>
+        <w:tc>
+          <w:tcPr>
+            <w:tcW w:type="dxa" w:w="2551"/>
+            <w:shd w:val="clear" w:color="auto" w:fill="2E74B5"/>
+          </w:tcPr>
+          <w:p>
+            <w:r/>
+            <w:r>
+              <w:rPr>
+                <w:b/>
+                <w:color w:val="FFFFFF"/>
+                <w:sz w:val="18"/>
+              </w:rPr>
+              <w:t>Étape</w:t>
+            </w:r>
+          </w:p>
+        </w:tc>
+        <w:tc>
+          <w:tcPr>
+            <w:tcW w:type="dxa" w:w="5953"/>
+            <w:shd w:val="clear" w:color="auto" w:fill="2E74B5"/>
+          </w:tcPr>
+          <w:p>
+            <w:r/>
+            <w:r>
+              <w:rPr>
+                <w:b/>
+                <w:color w:val="FFFFFF"/>
+                <w:sz w:val="18"/>
+              </w:rPr>
+              <w:t>Description</w:t>
+            </w:r>
+          </w:p>
+        </w:tc>
+      </w:tr>
+      <w:tr>
+        <w:tc>
+          <w:tcPr>
+            <w:tcW w:type="dxa" w:w="2551"/>
+          </w:tcPr>
+          <w:p>
+            <w:r/>
+            <w:r>
+              <w:rPr>
+                <w:sz w:val="18"/>
+              </w:rPr>
+              <w:t>1. Constat contradictoire</w:t>
+            </w:r>
+          </w:p>
+        </w:tc>
+        <w:tc>
+          <w:tcPr>
+            <w:tcW w:type="dxa" w:w="5953"/>
+          </w:tcPr>
+          <w:p>
+            <w:r/>
+            <w:r>
+              <w:rPr>
+                <w:sz w:val="18"/>
+              </w:rPr>
+              <w:t>Réalisé avec le MOE avant toute dépose des faux plafonds existants conservés (provision 67 m²)</w:t>
+            </w:r>
+          </w:p>
+        </w:tc>
+      </w:tr>
+      <w:tr>
+        <w:tc>
+          <w:tcPr>
+            <w:tcW w:type="dxa" w:w="2551"/>
+          </w:tcPr>
+          <w:p>
+            <w:r/>
+            <w:r>
+              <w:rPr>
+                <w:sz w:val="18"/>
+              </w:rPr>
+              <w:t>2. Dépose</w:t>
+            </w:r>
+          </w:p>
+        </w:tc>
+        <w:tc>
+          <w:tcPr>
+            <w:tcW w:type="dxa" w:w="5953"/>
+          </w:tcPr>
+          <w:p>
+            <w:r/>
+            <w:r>
+              <w:rPr>
+                <w:sz w:val="18"/>
+              </w:rPr>
+              <w:t>Démontage soigné des dalles et de l'ossature existante</w:t>
+            </w:r>
+          </w:p>
+        </w:tc>
+      </w:tr>
+      <w:tr>
+        <w:tc>
+          <w:tcPr>
+            <w:tcW w:type="dxa" w:w="2551"/>
+          </w:tcPr>
+          <w:p>
+            <w:r/>
+            <w:r>
+              <w:rPr>
+                <w:sz w:val="18"/>
+              </w:rPr>
+              <w:t>3. Tri et remplacement</w:t>
+            </w:r>
+          </w:p>
+        </w:tc>
+        <w:tc>
+          <w:tcPr>
+            <w:tcW w:type="dxa" w:w="5953"/>
+          </w:tcPr>
+          <w:p>
+            <w:r/>
+            <w:r>
+              <w:rPr>
+                <w:sz w:val="18"/>
+              </w:rPr>
+              <w:t>Remplacement des dalles et éléments d'ossature en mauvais état</w:t>
+            </w:r>
+          </w:p>
+        </w:tc>
+      </w:tr>
+      <w:tr>
+        <w:tc>
+          <w:tcPr>
+            <w:tcW w:type="dxa" w:w="2551"/>
+          </w:tcPr>
+          <w:p>
+            <w:r/>
+            <w:r>
+              <w:rPr>
+                <w:sz w:val="18"/>
+              </w:rPr>
+              <w:t>4. Réservations</w:t>
+            </w:r>
+          </w:p>
+        </w:tc>
+        <w:tc>
+          <w:tcPr>
+            <w:tcW w:type="dxa" w:w="5953"/>
+          </w:tcPr>
+          <w:p>
+            <w:r/>
+            <w:r>
+              <w:rPr>
+                <w:sz w:val="18"/>
+              </w:rPr>
+              <w:t>Réalisation des réservations nécessaires aux équipements des lots techniques</w:t>
+            </w:r>
+          </w:p>
+        </w:tc>
+      </w:tr>
+      <w:tr>
+        <w:tc>
+          <w:tcPr>
+            <w:tcW w:type="dxa" w:w="2551"/>
+          </w:tcPr>
+          <w:p>
+            <w:r/>
+            <w:r>
+              <w:rPr>
+                <w:sz w:val="18"/>
+              </w:rPr>
+              <w:t>5. Repose</w:t>
+            </w:r>
+          </w:p>
+        </w:tc>
+        <w:tc>
+          <w:tcPr>
+            <w:tcW w:type="dxa" w:w="5953"/>
+          </w:tcPr>
+          <w:p>
+            <w:r/>
+            <w:r>
+              <w:rPr>
+                <w:sz w:val="18"/>
+              </w:rPr>
+              <w:t>Remontage de l'ossature et des dalles, contrôle de planéité</w:t>
+            </w:r>
+          </w:p>
+        </w:tc>
+      </w:tr>
+    </w:tbl>
+    <w:p/>
     <w:p>
       <w:r>
         <w:br w:type="page"/>
@@ -3626,7 +4173,7 @@
           <w:i w:val="0"/>
           <w:sz w:val="21"/>
         </w:rPr>
-        <w:t>Les travaux de peinture sont exécutés conformément aux DTU 59.1 et 59.4 et aux spécifications techniques U.N.P., avec des systèmes à très faible émission de C.O.V. certifiés Ecolabel : Indeko Bio Fix / Indeko Satin (Caparol) pour les murs, Muroprim / Garnysatin S2P (Seigneurie) pour plafonds, boiseries, métaux et PVC (Art. III.3.02 et IV.6 du CCTP). Cette phase est positionnée en semaine Mois 4 - S2 de notre planning (chapitre 3), après les faux plafonds et avant les sols souples, avec un effectif de 3 personnes.</w:t>
+        <w:t>Les travaux de peinture sont exécutés conformément aux DTU 59.1 et 59.4 et aux spécifications techniques U.N.P., avec des systèmes à très faible émission de C.O.V. certifiés Ecolabel : Indeko Bio Fix / Indeko Satin (Caparol) pour les murs, Muroprim / Garnysatin S2P (Seigneurie) pour plafonds, boiseries, métaux et PVC. Cette phase est positionnée en semaine Mois 4 - S2 de notre planning (chapitre 3), après les faux plafonds et avant les sols souples, avec un effectif de 3 personnes.</w:t>
       </w:r>
     </w:p>
     <w:p>
@@ -3643,16 +4190,205 @@
         <w:t>2.9.1. Reconnaissance et préparation des supports</w:t>
       </w:r>
     </w:p>
-    <w:p>
-      <w:r>
-        <w:rPr>
-          <w:b w:val="0"/>
-          <w:i w:val="0"/>
-          <w:sz w:val="21"/>
-        </w:rPr>
-        <w:t>Une reconnaissance contradictoire des subjectiles est réalisée avec le MOE avant tout commencement d'exécution (Art. III.3.02) : identification des défauts (fissures, faux-aplomb, plâtres morts) à rectifier avant peinture, formulation de réserves écrites le cas échéant. Les opérations préparatoires (égrenage, brossage, ponçage, rebouchage, masticage, époussetage, dégraissage) sont systématiquement réalisées avant application.</w:t>
-      </w:r>
-    </w:p>
+    <w:tbl>
+      <w:tblPr>
+        <w:tblStyle w:val="TableGrid"/>
+        <w:tblW w:type="auto" w:w="0"/>
+        <w:jc w:val="center"/>
+        <w:tblLook w:firstColumn="1" w:firstRow="1" w:lastColumn="0" w:lastRow="0" w:noHBand="0" w:noVBand="1" w:val="04A0"/>
+      </w:tblPr>
+      <w:tblGrid>
+        <w:gridCol w:w="4986"/>
+        <w:gridCol w:w="4986"/>
+      </w:tblGrid>
+      <w:tr>
+        <w:tc>
+          <w:tcPr>
+            <w:tcW w:type="dxa" w:w="3118"/>
+            <w:shd w:val="clear" w:color="auto" w:fill="2E74B5"/>
+          </w:tcPr>
+          <w:p>
+            <w:r/>
+            <w:r>
+              <w:rPr>
+                <w:b/>
+                <w:color w:val="FFFFFF"/>
+                <w:sz w:val="18"/>
+              </w:rPr>
+              <w:t>Étape</w:t>
+            </w:r>
+          </w:p>
+        </w:tc>
+        <w:tc>
+          <w:tcPr>
+            <w:tcW w:type="dxa" w:w="5386"/>
+            <w:shd w:val="clear" w:color="auto" w:fill="2E74B5"/>
+          </w:tcPr>
+          <w:p>
+            <w:r/>
+            <w:r>
+              <w:rPr>
+                <w:b/>
+                <w:color w:val="FFFFFF"/>
+                <w:sz w:val="18"/>
+              </w:rPr>
+              <w:t>Description</w:t>
+            </w:r>
+          </w:p>
+        </w:tc>
+      </w:tr>
+      <w:tr>
+        <w:tc>
+          <w:tcPr>
+            <w:tcW w:type="dxa" w:w="3118"/>
+          </w:tcPr>
+          <w:p>
+            <w:r/>
+            <w:r>
+              <w:rPr>
+                <w:sz w:val="18"/>
+              </w:rPr>
+              <w:t>1. Reconnaissance contradictoire des subjectiles</w:t>
+            </w:r>
+          </w:p>
+        </w:tc>
+        <w:tc>
+          <w:tcPr>
+            <w:tcW w:type="dxa" w:w="5386"/>
+          </w:tcPr>
+          <w:p>
+            <w:r/>
+            <w:r>
+              <w:rPr>
+                <w:sz w:val="18"/>
+              </w:rPr>
+              <w:t>Réalisée avec le MOE avant tout commencement d'exécution</w:t>
+            </w:r>
+          </w:p>
+        </w:tc>
+      </w:tr>
+      <w:tr>
+        <w:tc>
+          <w:tcPr>
+            <w:tcW w:type="dxa" w:w="3118"/>
+          </w:tcPr>
+          <w:p>
+            <w:r/>
+            <w:r>
+              <w:rPr>
+                <w:sz w:val="18"/>
+              </w:rPr>
+              <w:t>2. Identification des défauts</w:t>
+            </w:r>
+          </w:p>
+        </w:tc>
+        <w:tc>
+          <w:tcPr>
+            <w:tcW w:type="dxa" w:w="5386"/>
+          </w:tcPr>
+          <w:p>
+            <w:r/>
+            <w:r>
+              <w:rPr>
+                <w:sz w:val="18"/>
+              </w:rPr>
+              <w:t>Fissures, faux-aplomb, plâtres morts à rectifier avant peinture ; formulation de réserves écrites le cas échéant</w:t>
+            </w:r>
+          </w:p>
+        </w:tc>
+      </w:tr>
+      <w:tr>
+        <w:tc>
+          <w:tcPr>
+            <w:tcW w:type="dxa" w:w="3118"/>
+          </w:tcPr>
+          <w:p>
+            <w:r/>
+            <w:r>
+              <w:rPr>
+                <w:sz w:val="18"/>
+              </w:rPr>
+              <w:t>3. Égrenage / brossage / ponçage</w:t>
+            </w:r>
+          </w:p>
+        </w:tc>
+        <w:tc>
+          <w:tcPr>
+            <w:tcW w:type="dxa" w:w="5386"/>
+          </w:tcPr>
+          <w:p>
+            <w:r/>
+            <w:r>
+              <w:rPr>
+                <w:sz w:val="18"/>
+              </w:rPr>
+              <w:t>Élimination des irrégularités de surface</w:t>
+            </w:r>
+          </w:p>
+        </w:tc>
+      </w:tr>
+      <w:tr>
+        <w:tc>
+          <w:tcPr>
+            <w:tcW w:type="dxa" w:w="3118"/>
+          </w:tcPr>
+          <w:p>
+            <w:r/>
+            <w:r>
+              <w:rPr>
+                <w:sz w:val="18"/>
+              </w:rPr>
+              <w:t>4. Rebouchage / masticage</w:t>
+            </w:r>
+          </w:p>
+        </w:tc>
+        <w:tc>
+          <w:tcPr>
+            <w:tcW w:type="dxa" w:w="5386"/>
+          </w:tcPr>
+          <w:p>
+            <w:r/>
+            <w:r>
+              <w:rPr>
+                <w:sz w:val="18"/>
+              </w:rPr>
+              <w:t>Traitement des défauts localisés</w:t>
+            </w:r>
+          </w:p>
+        </w:tc>
+      </w:tr>
+      <w:tr>
+        <w:tc>
+          <w:tcPr>
+            <w:tcW w:type="dxa" w:w="3118"/>
+          </w:tcPr>
+          <w:p>
+            <w:r/>
+            <w:r>
+              <w:rPr>
+                <w:sz w:val="18"/>
+              </w:rPr>
+              <w:t>5. Époussetage / dégraissage</w:t>
+            </w:r>
+          </w:p>
+        </w:tc>
+        <w:tc>
+          <w:tcPr>
+            <w:tcW w:type="dxa" w:w="5386"/>
+          </w:tcPr>
+          <w:p>
+            <w:r/>
+            <w:r>
+              <w:rPr>
+                <w:sz w:val="18"/>
+              </w:rPr>
+              <w:t>Préparation finale avant application</w:t>
+            </w:r>
+          </w:p>
+        </w:tc>
+      </w:tr>
+    </w:tbl>
+    <w:p/>
     <w:p>
       <w:pPr>
         <w:spacing w:before="160" w:after="60"/>
@@ -3692,7 +4428,7 @@
                 <w:color w:val="FFFFFF"/>
                 <w:sz w:val="18"/>
               </w:rPr>
-              <w:t>Étape (Art. IV.6.01)</w:t>
+              <w:t>Étape</w:t>
             </w:r>
           </w:p>
         </w:tc>
@@ -3915,7 +4651,7 @@
                 <w:color w:val="FFFFFF"/>
                 <w:sz w:val="18"/>
               </w:rPr>
-              <w:t>Type de support (Art. IV.6.02)</w:t>
+              <w:t>Type de support</w:t>
             </w:r>
           </w:p>
         </w:tc>
@@ -4006,7 +4742,7 @@
           <w:i/>
           <w:sz w:val="21"/>
         </w:rPr>
-        <w:t>Locaux traités : ensemble des locaux du projet identifiés au CCTP, plus une provision de 70 m² en reprise de peinture pour la circulation N°5.</w:t>
+        <w:t>Locaux traités : ensemble des locaux du projet, plus une provision de 70 m² en reprise de peinture pour la circulation N°5.</w:t>
       </w:r>
     </w:p>
     <w:p>
@@ -4048,7 +4784,7 @@
                 <w:color w:val="FFFFFF"/>
                 <w:sz w:val="18"/>
               </w:rPr>
-              <w:t>Support (Art. IV.6.03 à IV.6.05)</w:t>
+              <w:t>Support</w:t>
             </w:r>
           </w:p>
         </w:tc>
@@ -4277,7 +5013,7 @@
           <w:i w:val="0"/>
           <w:sz w:val="21"/>
         </w:rPr>
-        <w:t>Les revêtements de sols souples sont posés conformément au DTU 53.2 et aux prescriptions particulières du CCTP (Art. III.4 et IV.8), sur chapes béton surfacé livrées par le lot Maçonnerie ou sur plancher/dalles existantes. Cette phase est positionnée en semaine Mois 4 - S3 de notre planning (chapitre 3), en toute fin de séquence du lot afin de préserver les revêtements fraîchement posés, avec un effectif de 2 personnes.</w:t>
+        <w:t>Les revêtements de sols souples sont posés conformément au DTU 53.2, sur chapes béton surfacé livrées par le lot Maçonnerie ou sur plancher/dalles existantes. Cette phase est positionnée en semaine Mois 4 - S3 de notre planning (chapitre 3), en toute fin de séquence du lot afin de préserver les revêtements fraîchement posés, avec un effectif de 2 personnes.</w:t>
       </w:r>
     </w:p>
     <w:p>
@@ -4294,16 +5030,175 @@
         <w:t>2.10.1. Contrôle et préparation des supports</w:t>
       </w:r>
     </w:p>
-    <w:p>
-      <w:r>
-        <w:rPr>
-          <w:b w:val="0"/>
-          <w:i w:val="0"/>
-          <w:sz w:val="21"/>
-        </w:rPr>
-        <w:t>Avant tout commencement de pose, nous procédons à un contrôle contradictoire de la bonne exécution des supports (planéité, propreté) et signalons sans délai au MOE toute imperfection constatée. Le taux d'humidité des supports est systématiquement vérifié avant pose (Art. IV.8.03 et IV.8.04) ; en zone scanner, ce contrôle est réalisé après réception du renfort structurel du Lot 1 (cf. § 1.5.1).</w:t>
-      </w:r>
-    </w:p>
+    <w:tbl>
+      <w:tblPr>
+        <w:tblStyle w:val="TableGrid"/>
+        <w:tblW w:type="auto" w:w="0"/>
+        <w:jc w:val="center"/>
+        <w:tblLook w:firstColumn="1" w:firstRow="1" w:lastColumn="0" w:lastRow="0" w:noHBand="0" w:noVBand="1" w:val="04A0"/>
+      </w:tblPr>
+      <w:tblGrid>
+        <w:gridCol w:w="4986"/>
+        <w:gridCol w:w="4986"/>
+      </w:tblGrid>
+      <w:tr>
+        <w:tc>
+          <w:tcPr>
+            <w:tcW w:type="dxa" w:w="3118"/>
+            <w:shd w:val="clear" w:color="auto" w:fill="2E74B5"/>
+          </w:tcPr>
+          <w:p>
+            <w:r/>
+            <w:r>
+              <w:rPr>
+                <w:b/>
+                <w:color w:val="FFFFFF"/>
+                <w:sz w:val="18"/>
+              </w:rPr>
+              <w:t>Étape</w:t>
+            </w:r>
+          </w:p>
+        </w:tc>
+        <w:tc>
+          <w:tcPr>
+            <w:tcW w:type="dxa" w:w="5386"/>
+            <w:shd w:val="clear" w:color="auto" w:fill="2E74B5"/>
+          </w:tcPr>
+          <w:p>
+            <w:r/>
+            <w:r>
+              <w:rPr>
+                <w:b/>
+                <w:color w:val="FFFFFF"/>
+                <w:sz w:val="18"/>
+              </w:rPr>
+              <w:t>Description</w:t>
+            </w:r>
+          </w:p>
+        </w:tc>
+      </w:tr>
+      <w:tr>
+        <w:tc>
+          <w:tcPr>
+            <w:tcW w:type="dxa" w:w="3118"/>
+          </w:tcPr>
+          <w:p>
+            <w:r/>
+            <w:r>
+              <w:rPr>
+                <w:sz w:val="18"/>
+              </w:rPr>
+              <w:t>1. Contrôle contradictoire des supports</w:t>
+            </w:r>
+          </w:p>
+        </w:tc>
+        <w:tc>
+          <w:tcPr>
+            <w:tcW w:type="dxa" w:w="5386"/>
+          </w:tcPr>
+          <w:p>
+            <w:r/>
+            <w:r>
+              <w:rPr>
+                <w:sz w:val="18"/>
+              </w:rPr>
+              <w:t>Planéité, propreté ; toute imperfection est signalée sans délai au MOE</w:t>
+            </w:r>
+          </w:p>
+        </w:tc>
+      </w:tr>
+      <w:tr>
+        <w:tc>
+          <w:tcPr>
+            <w:tcW w:type="dxa" w:w="3118"/>
+          </w:tcPr>
+          <w:p>
+            <w:r/>
+            <w:r>
+              <w:rPr>
+                <w:sz w:val="18"/>
+              </w:rPr>
+              <w:t>2. Point d'arrêt zone scanner</w:t>
+            </w:r>
+          </w:p>
+        </w:tc>
+        <w:tc>
+          <w:tcPr>
+            <w:tcW w:type="dxa" w:w="5386"/>
+          </w:tcPr>
+          <w:p>
+            <w:r/>
+            <w:r>
+              <w:rPr>
+                <w:sz w:val="18"/>
+              </w:rPr>
+              <w:t>Contrôle réalisé après réception du renfort structurel du Lot 1 (cf. § 1.5.1)</w:t>
+            </w:r>
+          </w:p>
+        </w:tc>
+      </w:tr>
+      <w:tr>
+        <w:tc>
+          <w:tcPr>
+            <w:tcW w:type="dxa" w:w="3118"/>
+          </w:tcPr>
+          <w:p>
+            <w:r/>
+            <w:r>
+              <w:rPr>
+                <w:sz w:val="18"/>
+              </w:rPr>
+              <w:t>3. Contrôle du taux d'humidité</w:t>
+            </w:r>
+          </w:p>
+        </w:tc>
+        <w:tc>
+          <w:tcPr>
+            <w:tcW w:type="dxa" w:w="5386"/>
+          </w:tcPr>
+          <w:p>
+            <w:r/>
+            <w:r>
+              <w:rPr>
+                <w:sz w:val="18"/>
+              </w:rPr>
+              <w:t>Vérification systématique avant pose</w:t>
+            </w:r>
+          </w:p>
+        </w:tc>
+      </w:tr>
+      <w:tr>
+        <w:tc>
+          <w:tcPr>
+            <w:tcW w:type="dxa" w:w="3118"/>
+          </w:tcPr>
+          <w:p>
+            <w:r/>
+            <w:r>
+              <w:rPr>
+                <w:sz w:val="18"/>
+              </w:rPr>
+              <w:t>4. Nettoyage complémentaire de la chape</w:t>
+            </w:r>
+          </w:p>
+        </w:tc>
+        <w:tc>
+          <w:tcPr>
+            <w:tcW w:type="dxa" w:w="5386"/>
+          </w:tcPr>
+          <w:p>
+            <w:r/>
+            <w:r>
+              <w:rPr>
+                <w:sz w:val="18"/>
+              </w:rPr>
+              <w:t>Avant application du primaire d'accrochage</w:t>
+            </w:r>
+          </w:p>
+        </w:tc>
+      </w:tr>
+    </w:tbl>
+    <w:p/>
     <w:p>
       <w:pPr>
         <w:spacing w:before="160" w:after="60"/>
@@ -4318,16 +5213,175 @@
         <w:t>2.10.2. Ragréage des supports</w:t>
       </w:r>
     </w:p>
-    <w:p>
-      <w:r>
-        <w:rPr>
-          <w:b w:val="0"/>
-          <w:i w:val="0"/>
-          <w:sz w:val="21"/>
-        </w:rPr>
-        <w:t>Après nettoyage complémentaire de la chape, un primaire d'accrochage Weberprim RP (Weber) est appliqué, suivi d'un enduit de lissage Weberniv Dur+ (Nivdur S, Weber), classement P.3, épaisseur minimale 3mm (Art. IV.8.01). Le rattrapage des différences de niveau importantes est réalisé au Cegecol PE avec primaire d'accrochage associé Emulcim (Cegecol). L'enduit fait l'objet d'un avis technique CSTB soumis à validation du MOE et du Bureau de Contrôle.</w:t>
-      </w:r>
-    </w:p>
+    <w:tbl>
+      <w:tblPr>
+        <w:tblStyle w:val="TableGrid"/>
+        <w:tblW w:type="auto" w:w="0"/>
+        <w:jc w:val="center"/>
+        <w:tblLook w:firstColumn="1" w:firstRow="1" w:lastColumn="0" w:lastRow="0" w:noHBand="0" w:noVBand="1" w:val="04A0"/>
+      </w:tblPr>
+      <w:tblGrid>
+        <w:gridCol w:w="4986"/>
+        <w:gridCol w:w="4986"/>
+      </w:tblGrid>
+      <w:tr>
+        <w:tc>
+          <w:tcPr>
+            <w:tcW w:type="dxa" w:w="3118"/>
+            <w:shd w:val="clear" w:color="auto" w:fill="2E74B5"/>
+          </w:tcPr>
+          <w:p>
+            <w:r/>
+            <w:r>
+              <w:rPr>
+                <w:b/>
+                <w:color w:val="FFFFFF"/>
+                <w:sz w:val="18"/>
+              </w:rPr>
+              <w:t>Étape</w:t>
+            </w:r>
+          </w:p>
+        </w:tc>
+        <w:tc>
+          <w:tcPr>
+            <w:tcW w:type="dxa" w:w="5386"/>
+            <w:shd w:val="clear" w:color="auto" w:fill="2E74B5"/>
+          </w:tcPr>
+          <w:p>
+            <w:r/>
+            <w:r>
+              <w:rPr>
+                <w:b/>
+                <w:color w:val="FFFFFF"/>
+                <w:sz w:val="18"/>
+              </w:rPr>
+              <w:t>Description / produit mis en œuvre</w:t>
+            </w:r>
+          </w:p>
+        </w:tc>
+      </w:tr>
+      <w:tr>
+        <w:tc>
+          <w:tcPr>
+            <w:tcW w:type="dxa" w:w="3118"/>
+          </w:tcPr>
+          <w:p>
+            <w:r/>
+            <w:r>
+              <w:rPr>
+                <w:sz w:val="18"/>
+              </w:rPr>
+              <w:t>1. Primaire d'accrochage</w:t>
+            </w:r>
+          </w:p>
+        </w:tc>
+        <w:tc>
+          <w:tcPr>
+            <w:tcW w:type="dxa" w:w="5386"/>
+          </w:tcPr>
+          <w:p>
+            <w:r/>
+            <w:r>
+              <w:rPr>
+                <w:sz w:val="18"/>
+              </w:rPr>
+              <w:t>Weberprim RP (Weber)</w:t>
+            </w:r>
+          </w:p>
+        </w:tc>
+      </w:tr>
+      <w:tr>
+        <w:tc>
+          <w:tcPr>
+            <w:tcW w:type="dxa" w:w="3118"/>
+          </w:tcPr>
+          <w:p>
+            <w:r/>
+            <w:r>
+              <w:rPr>
+                <w:sz w:val="18"/>
+              </w:rPr>
+              <w:t>2. Enduit de lissage</w:t>
+            </w:r>
+          </w:p>
+        </w:tc>
+        <w:tc>
+          <w:tcPr>
+            <w:tcW w:type="dxa" w:w="5386"/>
+          </w:tcPr>
+          <w:p>
+            <w:r/>
+            <w:r>
+              <w:rPr>
+                <w:sz w:val="18"/>
+              </w:rPr>
+              <w:t>Weberniv Dur+ / Nivdur S (Weber), classement P.3, épaisseur minimale 3mm</w:t>
+            </w:r>
+          </w:p>
+        </w:tc>
+      </w:tr>
+      <w:tr>
+        <w:tc>
+          <w:tcPr>
+            <w:tcW w:type="dxa" w:w="3118"/>
+          </w:tcPr>
+          <w:p>
+            <w:r/>
+            <w:r>
+              <w:rPr>
+                <w:sz w:val="18"/>
+              </w:rPr>
+              <w:t>3. Rattrapage des niveaux importants</w:t>
+            </w:r>
+          </w:p>
+        </w:tc>
+        <w:tc>
+          <w:tcPr>
+            <w:tcW w:type="dxa" w:w="5386"/>
+          </w:tcPr>
+          <w:p>
+            <w:r/>
+            <w:r>
+              <w:rPr>
+                <w:sz w:val="18"/>
+              </w:rPr>
+              <w:t>Cegecol PE avec primaire d'accrochage associé Emulcim (Cegecol)</w:t>
+            </w:r>
+          </w:p>
+        </w:tc>
+      </w:tr>
+      <w:tr>
+        <w:tc>
+          <w:tcPr>
+            <w:tcW w:type="dxa" w:w="3118"/>
+          </w:tcPr>
+          <w:p>
+            <w:r/>
+            <w:r>
+              <w:rPr>
+                <w:sz w:val="18"/>
+              </w:rPr>
+              <w:t>4. Validation</w:t>
+            </w:r>
+          </w:p>
+        </w:tc>
+        <w:tc>
+          <w:tcPr>
+            <w:tcW w:type="dxa" w:w="5386"/>
+          </w:tcPr>
+          <w:p>
+            <w:r/>
+            <w:r>
+              <w:rPr>
+                <w:sz w:val="18"/>
+              </w:rPr>
+              <w:t>Enduit soumis à l'avis du MOE et du Bureau de Contrôle avant pose des revêtements</w:t>
+            </w:r>
+          </w:p>
+        </w:tc>
+      </w:tr>
+    </w:tbl>
+    <w:p/>
     <w:p>
       <w:pPr>
         <w:spacing w:before="160" w:after="60"/>
@@ -4342,16 +5396,145 @@
         <w:t>2.10.3. Encollage et mise en œuvre des revêtements</w:t>
       </w:r>
     </w:p>
-    <w:p>
-      <w:r>
-        <w:rPr>
-          <w:b w:val="0"/>
-          <w:i w:val="0"/>
-          <w:sz w:val="21"/>
-        </w:rPr>
-        <w:t>L'encollage est réalisé avec la colle PVC Uzin KE 2000S (Uzin), compatible avec les revêtements Taralay Impression Compact 43 et Mipolam Planet ainsi qu'avec le support ragréé, conformément aux recommandations du fabricant (Art. IV.8.02). La pose est réalisée lé par lé, lés/dalles parfaitement jointifs et de niveau, calepinage conforme au plan validé par le MOE ; l'emploi de chutes est proscrit.</w:t>
-      </w:r>
-    </w:p>
+    <w:tbl>
+      <w:tblPr>
+        <w:tblStyle w:val="TableGrid"/>
+        <w:tblW w:type="auto" w:w="0"/>
+        <w:jc w:val="center"/>
+        <w:tblLook w:firstColumn="1" w:firstRow="1" w:lastColumn="0" w:lastRow="0" w:noHBand="0" w:noVBand="1" w:val="04A0"/>
+      </w:tblPr>
+      <w:tblGrid>
+        <w:gridCol w:w="4986"/>
+        <w:gridCol w:w="4986"/>
+      </w:tblGrid>
+      <w:tr>
+        <w:tc>
+          <w:tcPr>
+            <w:tcW w:type="dxa" w:w="3118"/>
+            <w:shd w:val="clear" w:color="auto" w:fill="2E74B5"/>
+          </w:tcPr>
+          <w:p>
+            <w:r/>
+            <w:r>
+              <w:rPr>
+                <w:b/>
+                <w:color w:val="FFFFFF"/>
+                <w:sz w:val="18"/>
+              </w:rPr>
+              <w:t>Étape</w:t>
+            </w:r>
+          </w:p>
+        </w:tc>
+        <w:tc>
+          <w:tcPr>
+            <w:tcW w:type="dxa" w:w="5386"/>
+            <w:shd w:val="clear" w:color="auto" w:fill="2E74B5"/>
+          </w:tcPr>
+          <w:p>
+            <w:r/>
+            <w:r>
+              <w:rPr>
+                <w:b/>
+                <w:color w:val="FFFFFF"/>
+                <w:sz w:val="18"/>
+              </w:rPr>
+              <w:t>Description</w:t>
+            </w:r>
+          </w:p>
+        </w:tc>
+      </w:tr>
+      <w:tr>
+        <w:tc>
+          <w:tcPr>
+            <w:tcW w:type="dxa" w:w="3118"/>
+          </w:tcPr>
+          <w:p>
+            <w:r/>
+            <w:r>
+              <w:rPr>
+                <w:sz w:val="18"/>
+              </w:rPr>
+              <w:t>1. Encollage</w:t>
+            </w:r>
+          </w:p>
+        </w:tc>
+        <w:tc>
+          <w:tcPr>
+            <w:tcW w:type="dxa" w:w="5386"/>
+          </w:tcPr>
+          <w:p>
+            <w:r/>
+            <w:r>
+              <w:rPr>
+                <w:sz w:val="18"/>
+              </w:rPr>
+              <w:t>Colle PVC Uzin KE 2000S (Uzin), compatible avec Taralay Impression Compact 43, Mipolam Planet et le support ragréé</w:t>
+            </w:r>
+          </w:p>
+        </w:tc>
+      </w:tr>
+      <w:tr>
+        <w:tc>
+          <w:tcPr>
+            <w:tcW w:type="dxa" w:w="3118"/>
+          </w:tcPr>
+          <w:p>
+            <w:r/>
+            <w:r>
+              <w:rPr>
+                <w:sz w:val="18"/>
+              </w:rPr>
+              <w:t>2. Calepinage</w:t>
+            </w:r>
+          </w:p>
+        </w:tc>
+        <w:tc>
+          <w:tcPr>
+            <w:tcW w:type="dxa" w:w="5386"/>
+          </w:tcPr>
+          <w:p>
+            <w:r/>
+            <w:r>
+              <w:rPr>
+                <w:sz w:val="18"/>
+              </w:rPr>
+              <w:t>Pose lé par lé selon le plan validé par le MOE</w:t>
+            </w:r>
+          </w:p>
+        </w:tc>
+      </w:tr>
+      <w:tr>
+        <w:tc>
+          <w:tcPr>
+            <w:tcW w:type="dxa" w:w="3118"/>
+          </w:tcPr>
+          <w:p>
+            <w:r/>
+            <w:r>
+              <w:rPr>
+                <w:sz w:val="18"/>
+              </w:rPr>
+              <w:t>3. Jointoiement</w:t>
+            </w:r>
+          </w:p>
+        </w:tc>
+        <w:tc>
+          <w:tcPr>
+            <w:tcW w:type="dxa" w:w="5386"/>
+          </w:tcPr>
+          <w:p>
+            <w:r/>
+            <w:r>
+              <w:rPr>
+                <w:sz w:val="18"/>
+              </w:rPr>
+              <w:t>Lés/dalles parfaitement jointifs et de niveau ; emploi de chutes proscrit</w:t>
+            </w:r>
+          </w:p>
+        </w:tc>
+      </w:tr>
+    </w:tbl>
+    <w:p/>
     <w:p>
       <w:pPr>
         <w:spacing w:before="160" w:after="60"/>
@@ -4370,10 +5553,10 @@
       <w:r>
         <w:rPr>
           <w:b w:val="0"/>
-          <w:i w:val="0"/>
+          <w:i/>
           <w:sz w:val="21"/>
         </w:rPr>
-        <w:t>Sol PVC isophonique multicouche Taralay Impression Compact — Art. IV.8.03.</w:t>
+        <w:t>Sol PVC isophonique multicouche Taralay Impression Compact.</w:t>
       </w:r>
     </w:p>
     <w:tbl>
@@ -4623,10 +5806,10 @@
       <w:r>
         <w:rPr>
           <w:b w:val="0"/>
-          <w:i w:val="0"/>
+          <w:i/>
           <w:sz w:val="21"/>
         </w:rPr>
-        <w:t>Sol homogène compact Taralay Mipolam Planet — Art. IV.8.04, pour les locaux à plus forte exigence hygiénique.</w:t>
+        <w:t>Sol homogène compact Taralay Mipolam Planet, pour les locaux à plus forte exigence hygiénique.</w:t>
       </w:r>
     </w:p>
     <w:tbl>
@@ -4872,16 +6055,115 @@
         <w:t>2.10.6. Barres de seuil et reprises ponctuelles</w:t>
       </w:r>
     </w:p>
-    <w:p>
-      <w:r>
-        <w:rPr>
-          <w:b w:val="0"/>
-          <w:i w:val="0"/>
-          <w:sz w:val="21"/>
-        </w:rPr>
-        <w:t>Des barres de seuil laiton semi-bombées de 35mm (Art. IV.8.05) sont posées sur trous tamponnés entre revêtements de nature différente, avec ajustement en fond de feuillure des huisseries. Les reprises ponctuelles (Art. IV.8.06) — au droit des bouchements de baies et des nouvelles cloisons — sont réalisées avec des sols et plinthes de même nature que l'existant, en limite des locaux touchés par l'opération.</w:t>
-      </w:r>
-    </w:p>
+    <w:tbl>
+      <w:tblPr>
+        <w:tblStyle w:val="TableGrid"/>
+        <w:tblW w:type="auto" w:w="0"/>
+        <w:jc w:val="center"/>
+        <w:tblLook w:firstColumn="1" w:firstRow="1" w:lastColumn="0" w:lastRow="0" w:noHBand="0" w:noVBand="1" w:val="04A0"/>
+      </w:tblPr>
+      <w:tblGrid>
+        <w:gridCol w:w="4986"/>
+        <w:gridCol w:w="4986"/>
+      </w:tblGrid>
+      <w:tr>
+        <w:tc>
+          <w:tcPr>
+            <w:tcW w:type="dxa" w:w="2551"/>
+            <w:shd w:val="clear" w:color="auto" w:fill="2E74B5"/>
+          </w:tcPr>
+          <w:p>
+            <w:r/>
+            <w:r>
+              <w:rPr>
+                <w:b/>
+                <w:color w:val="FFFFFF"/>
+                <w:sz w:val="18"/>
+              </w:rPr>
+              <w:t>Ouvrage</w:t>
+            </w:r>
+          </w:p>
+        </w:tc>
+        <w:tc>
+          <w:tcPr>
+            <w:tcW w:type="dxa" w:w="5953"/>
+            <w:shd w:val="clear" w:color="auto" w:fill="2E74B5"/>
+          </w:tcPr>
+          <w:p>
+            <w:r/>
+            <w:r>
+              <w:rPr>
+                <w:b/>
+                <w:color w:val="FFFFFF"/>
+                <w:sz w:val="18"/>
+              </w:rPr>
+              <w:t>Méthode d'exécution</w:t>
+            </w:r>
+          </w:p>
+        </w:tc>
+      </w:tr>
+      <w:tr>
+        <w:tc>
+          <w:tcPr>
+            <w:tcW w:type="dxa" w:w="2551"/>
+          </w:tcPr>
+          <w:p>
+            <w:r/>
+            <w:r>
+              <w:rPr>
+                <w:sz w:val="18"/>
+              </w:rPr>
+              <w:t>Barres de seuil</w:t>
+            </w:r>
+          </w:p>
+        </w:tc>
+        <w:tc>
+          <w:tcPr>
+            <w:tcW w:type="dxa" w:w="5953"/>
+          </w:tcPr>
+          <w:p>
+            <w:r/>
+            <w:r>
+              <w:rPr>
+                <w:sz w:val="18"/>
+              </w:rPr>
+              <w:t>Pose sur trous tamponnés de barres laiton semi-bombées de 35mm, entre revêtements de nature différente, avec ajustement en fond de feuillure des huisseries</w:t>
+            </w:r>
+          </w:p>
+        </w:tc>
+      </w:tr>
+      <w:tr>
+        <w:tc>
+          <w:tcPr>
+            <w:tcW w:type="dxa" w:w="2551"/>
+          </w:tcPr>
+          <w:p>
+            <w:r/>
+            <w:r>
+              <w:rPr>
+                <w:sz w:val="18"/>
+              </w:rPr>
+              <w:t>Reprises ponctuelles</w:t>
+            </w:r>
+          </w:p>
+        </w:tc>
+        <w:tc>
+          <w:tcPr>
+            <w:tcW w:type="dxa" w:w="5953"/>
+          </w:tcPr>
+          <w:p>
+            <w:r/>
+            <w:r>
+              <w:rPr>
+                <w:sz w:val="18"/>
+              </w:rPr>
+              <w:t>Au droit des bouchements de baies et des nouvelles cloisons, réalisées avec des sols et plinthes de même nature que l'existant, en limite des locaux touchés par l'opération</w:t>
+            </w:r>
+          </w:p>
+        </w:tc>
+      </w:tr>
+    </w:tbl>
+    <w:p/>
     <w:p>
       <w:r>
         <w:br w:type="page"/>

</xml_diff>